<commit_message>
Booking.com affiliate links via CJ across all guides and the map; Strasbourg review fixes; hide NOT VERIFIED shorthand
Co-Authored-By: Claude Opus 5.5 <noreply@anthropic.com>
Claude-Session: https://claude.ai/code/session_01KbRqmNBFKCFFpD46r7T4m7
</commit_message>
<xml_diff>
--- a/new/guides/berlin/Berlin_Guide.docx
+++ b/new/guides/berlin/Berlin_Guide.docx
@@ -711,7 +711,7 @@
             </w:r>
           </w:p>
           <w:p>
-            <w:hyperlink w:history="1" r:id="rIdodu9oq2yp72xe5y_a-g72">
+            <w:hyperlink w:history="1" r:id="rIdazodtfkxk9kity7uvp1uj">
               <w:r>
                 <w:rPr>
                   <w:rStyle w:val="Hyperlink"/>
@@ -819,7 +819,7 @@
       </w:r>
     </w:p>
     <w:p>
-      <w:hyperlink w:history="1" r:id="rIdt1mda9hjwaqtw0ts6kadt">
+      <w:hyperlink w:history="1" r:id="rIdfuhvhqk-q3d56ibqmkjqa">
         <w:r>
           <w:rPr>
             <w:rStyle w:val="Hyperlink"/>
@@ -840,7 +840,7 @@
         </w:rPr>
         <w:t xml:space="preserve">Via </w:t>
       </w:r>
-      <w:hyperlink w:history="1" r:id="rIdtulr-du3t6a4tqk8xtnf8">
+      <w:hyperlink w:history="1" r:id="rId9lrsbodmcbpgfmoxacobf">
         <w:r>
           <w:rPr>
             <w:color w:val="EA2E00"/>
@@ -858,7 +858,7 @@
         </w:rPr>
         <w:t xml:space="preserve">, </w:t>
       </w:r>
-      <w:hyperlink w:history="1" r:id="rId7jbviub2rvve5g8usc4m3">
+      <w:hyperlink w:history="1" r:id="rIdepb84i3ojz9duc2klhf0f">
         <w:r>
           <w:rPr>
             <w:color w:val="EA2E00"/>
@@ -876,7 +876,7 @@
         </w:rPr>
         <w:t xml:space="preserve">, </w:t>
       </w:r>
-      <w:hyperlink w:history="1" r:id="rIdcqolfvy2yqgilt1pafg-h">
+      <w:hyperlink w:history="1" r:id="rIdqvwpqamlpdwj96bv1zn_b">
         <w:r>
           <w:rPr>
             <w:color w:val="EA2E00"/>
@@ -894,7 +894,7 @@
         </w:rPr>
         <w:t xml:space="preserve">, </w:t>
       </w:r>
-      <w:hyperlink w:history="1" r:id="rIdnj8g3emnyzt6n04ycpw1e">
+      <w:hyperlink w:history="1" r:id="rIdmz7ihijpwvdngjjopkvgk">
         <w:r>
           <w:rPr>
             <w:color w:val="EA2E00"/>
@@ -912,7 +912,7 @@
         </w:rPr>
         <w:t xml:space="preserve">, </w:t>
       </w:r>
-      <w:hyperlink w:history="1" r:id="rIdch40mie99y9dia43u6mwt">
+      <w:hyperlink w:history="1" r:id="rId2uwuuz14strwrcd7p8w6u">
         <w:r>
           <w:rPr>
             <w:color w:val="EA2E00"/>
@@ -930,7 +930,7 @@
         </w:rPr>
         <w:t xml:space="preserve">, </w:t>
       </w:r>
-      <w:hyperlink w:history="1" r:id="rIdxmrsycldlomwmvv2a025c">
+      <w:hyperlink w:history="1" r:id="rIdwrmkl34msweaqcnxk5-vf">
         <w:r>
           <w:rPr>
             <w:color w:val="EA2E00"/>
@@ -948,7 +948,7 @@
         </w:rPr>
         <w:t xml:space="preserve">, </w:t>
       </w:r>
-      <w:hyperlink w:history="1" r:id="rIdugooqlslxew2etqfu1per">
+      <w:hyperlink w:history="1" r:id="rIdzf_e1qw4vkuiieicek73t">
         <w:r>
           <w:rPr>
             <w:color w:val="EA2E00"/>
@@ -966,7 +966,7 @@
         </w:rPr>
         <w:t xml:space="preserve">, </w:t>
       </w:r>
-      <w:hyperlink w:history="1" r:id="rId7mxrku5v1a964k8akelbq">
+      <w:hyperlink w:history="1" r:id="rIdrrxbiayoznbba-wyjewdf">
         <w:r>
           <w:rPr>
             <w:color w:val="EA2E00"/>
@@ -1028,7 +1028,7 @@
       </w:r>
     </w:p>
     <w:p>
-      <w:hyperlink w:history="1" r:id="rIdaegxi2ydzvxyzjzwpnuc3">
+      <w:hyperlink w:history="1" r:id="rIdvlvo0cip5gz_whhutl-hw">
         <w:r>
           <w:rPr>
             <w:rStyle w:val="Hyperlink"/>
@@ -1049,7 +1049,7 @@
         </w:rPr>
         <w:t xml:space="preserve">Via </w:t>
       </w:r>
-      <w:hyperlink w:history="1" r:id="rIdbxsbcv8st2ry-hll1jwcx">
+      <w:hyperlink w:history="1" r:id="rIdb0gsdsho8qrt2b8qhvboe">
         <w:r>
           <w:rPr>
             <w:color w:val="EA2E00"/>
@@ -1067,7 +1067,7 @@
         </w:rPr>
         <w:t xml:space="preserve">, </w:t>
       </w:r>
-      <w:hyperlink w:history="1" r:id="rIdkb9xfgxhcgq3uz6mjso3i">
+      <w:hyperlink w:history="1" r:id="rIdxcybfur5wtw5deorqriec">
         <w:r>
           <w:rPr>
             <w:color w:val="EA2E00"/>
@@ -1085,7 +1085,7 @@
         </w:rPr>
         <w:t xml:space="preserve">, </w:t>
       </w:r>
-      <w:hyperlink w:history="1" r:id="rIdx6ekycjnaxhhais_dsla8">
+      <w:hyperlink w:history="1" r:id="rIdhh9tvir6fefdjyspe9s9k">
         <w:r>
           <w:rPr>
             <w:color w:val="EA2E00"/>
@@ -1103,7 +1103,7 @@
         </w:rPr>
         <w:t xml:space="preserve">, </w:t>
       </w:r>
-      <w:hyperlink w:history="1" r:id="rIdcceleziry9ljgzo8tiidk">
+      <w:hyperlink w:history="1" r:id="rId4i2utrnix7jlmxpusmuck">
         <w:r>
           <w:rPr>
             <w:color w:val="EA2E00"/>
@@ -1121,7 +1121,7 @@
         </w:rPr>
         <w:t xml:space="preserve">, </w:t>
       </w:r>
-      <w:hyperlink w:history="1" r:id="rId41q2z9tt_ri1wq8yznptl">
+      <w:hyperlink w:history="1" r:id="rIdmfb_cvwbkai4nh6z9y-ka">
         <w:r>
           <w:rPr>
             <w:color w:val="EA2E00"/>
@@ -1139,7 +1139,7 @@
         </w:rPr>
         <w:t xml:space="preserve">, </w:t>
       </w:r>
-      <w:hyperlink w:history="1" r:id="rId3e08zzbcfjlytd6kabp5g">
+      <w:hyperlink w:history="1" r:id="rId1ghetto6n_qssuiemlpyk">
         <w:r>
           <w:rPr>
             <w:color w:val="EA2E00"/>
@@ -1157,7 +1157,7 @@
         </w:rPr>
         <w:t xml:space="preserve">, </w:t>
       </w:r>
-      <w:hyperlink w:history="1" r:id="rIdyimdx5dj8hhksja6yeioo">
+      <w:hyperlink w:history="1" r:id="rIdlyyp352acuqgetdylqust">
         <w:r>
           <w:rPr>
             <w:color w:val="EA2E00"/>
@@ -1175,7 +1175,7 @@
         </w:rPr>
         <w:t xml:space="preserve">, </w:t>
       </w:r>
-      <w:hyperlink w:history="1" r:id="rIdldqpum-f-qon4j2kp_hyx">
+      <w:hyperlink w:history="1" r:id="rIdwba1e3cymfmx63nsdvdue">
         <w:r>
           <w:rPr>
             <w:color w:val="EA2E00"/>
@@ -1237,7 +1237,7 @@
       </w:r>
     </w:p>
     <w:p>
-      <w:hyperlink w:history="1" r:id="rIdf6vqubj7m2eozapombmuk">
+      <w:hyperlink w:history="1" r:id="rId7ify9tbxln1dl7vn9ythb">
         <w:r>
           <w:rPr>
             <w:rStyle w:val="Hyperlink"/>
@@ -1258,7 +1258,7 @@
         </w:rPr>
         <w:t xml:space="preserve">Via </w:t>
       </w:r>
-      <w:hyperlink w:history="1" r:id="rIdflfahi-5fwgtwa8jrcjkk">
+      <w:hyperlink w:history="1" r:id="rId-x8se7dxu0fevt1gtll0-">
         <w:r>
           <w:rPr>
             <w:color w:val="EA2E00"/>
@@ -1276,7 +1276,7 @@
         </w:rPr>
         <w:t xml:space="preserve">, </w:t>
       </w:r>
-      <w:hyperlink w:history="1" r:id="rIdmzggxcod7j6rq99n8jcm3">
+      <w:hyperlink w:history="1" r:id="rIdepyuvklin90hdba-plaac">
         <w:r>
           <w:rPr>
             <w:color w:val="EA2E00"/>
@@ -1294,7 +1294,7 @@
         </w:rPr>
         <w:t xml:space="preserve">, </w:t>
       </w:r>
-      <w:hyperlink w:history="1" r:id="rId-9-boatqvfcniuv8flcv2">
+      <w:hyperlink w:history="1" r:id="rIdgwxzyidmrnxmmrnjqce3w">
         <w:r>
           <w:rPr>
             <w:color w:val="EA2E00"/>
@@ -1312,7 +1312,7 @@
         </w:rPr>
         <w:t xml:space="preserve">, </w:t>
       </w:r>
-      <w:hyperlink w:history="1" r:id="rId90blspl2vqvdc8c9cvvzf">
+      <w:hyperlink w:history="1" r:id="rIdvqqa9t4_b_yhqavs0h41v">
         <w:r>
           <w:rPr>
             <w:color w:val="EA2E00"/>
@@ -1330,7 +1330,7 @@
         </w:rPr>
         <w:t xml:space="preserve">, </w:t>
       </w:r>
-      <w:hyperlink w:history="1" r:id="rId5mfpiaxbzei5ynxtjm7zf">
+      <w:hyperlink w:history="1" r:id="rId1bpl84_gc8mkaqf7qq7gf">
         <w:r>
           <w:rPr>
             <w:color w:val="EA2E00"/>
@@ -1348,7 +1348,7 @@
         </w:rPr>
         <w:t xml:space="preserve">, </w:t>
       </w:r>
-      <w:hyperlink w:history="1" r:id="rIdwvsih-j4amj8gtu1k5txq">
+      <w:hyperlink w:history="1" r:id="rIdc03zoopyqyvfzl16pfxie">
         <w:r>
           <w:rPr>
             <w:color w:val="EA2E00"/>
@@ -1366,7 +1366,7 @@
         </w:rPr>
         <w:t xml:space="preserve">, </w:t>
       </w:r>
-      <w:hyperlink w:history="1" r:id="rIdexujnrqw9s-qyowalob2u">
+      <w:hyperlink w:history="1" r:id="rIdaxiebgteayyq41nw8m4zu">
         <w:r>
           <w:rPr>
             <w:color w:val="EA2E00"/>
@@ -1428,7 +1428,7 @@
       </w:r>
     </w:p>
     <w:p>
-      <w:hyperlink w:history="1" r:id="rIdpdyydqkjoshg4fnn5-ppo">
+      <w:hyperlink w:history="1" r:id="rIdd68f52cy99pendp1vu7uw">
         <w:r>
           <w:rPr>
             <w:rStyle w:val="Hyperlink"/>
@@ -1449,7 +1449,7 @@
         </w:rPr>
         <w:t xml:space="preserve">Via </w:t>
       </w:r>
-      <w:hyperlink w:history="1" r:id="rIdxy4emdrnzcipk6twpdpji">
+      <w:hyperlink w:history="1" r:id="rIdowan0nyf7uft8m6vdr0iw">
         <w:r>
           <w:rPr>
             <w:color w:val="EA2E00"/>
@@ -1467,7 +1467,7 @@
         </w:rPr>
         <w:t xml:space="preserve">, </w:t>
       </w:r>
-      <w:hyperlink w:history="1" r:id="rIdcrta_ontyjwhn7vnbw07c">
+      <w:hyperlink w:history="1" r:id="rId02pqkcoezodassdvt_fyj">
         <w:r>
           <w:rPr>
             <w:color w:val="EA2E00"/>
@@ -1485,7 +1485,7 @@
         </w:rPr>
         <w:t xml:space="preserve">, </w:t>
       </w:r>
-      <w:hyperlink w:history="1" r:id="rIdgzrosoicj_kvjod6a466i">
+      <w:hyperlink w:history="1" r:id="rId_jlmrhdfcgsoq08w6kon6">
         <w:r>
           <w:rPr>
             <w:color w:val="EA2E00"/>
@@ -1547,7 +1547,7 @@
       </w:r>
     </w:p>
     <w:p>
-      <w:hyperlink w:history="1" r:id="rIdunvvhaf8odpqapus_jnyx">
+      <w:hyperlink w:history="1" r:id="rIdsfl1ahh6z4ecxnn2qz3qi">
         <w:r>
           <w:rPr>
             <w:rStyle w:val="Hyperlink"/>
@@ -1568,7 +1568,7 @@
         </w:rPr>
         <w:t xml:space="preserve">Via </w:t>
       </w:r>
-      <w:hyperlink w:history="1" r:id="rIditnwof-arxh8zkobjepsu">
+      <w:hyperlink w:history="1" r:id="rIdxrcwvgv_92vt72kdlserr">
         <w:r>
           <w:rPr>
             <w:color w:val="EA2E00"/>
@@ -1586,7 +1586,7 @@
         </w:rPr>
         <w:t xml:space="preserve">, </w:t>
       </w:r>
-      <w:hyperlink w:history="1" r:id="rIdxxnajaama-gkstykvhn3m">
+      <w:hyperlink w:history="1" r:id="rIdp0c92l-krdr31tmykbpj-">
         <w:r>
           <w:rPr>
             <w:color w:val="EA2E00"/>
@@ -1604,7 +1604,7 @@
         </w:rPr>
         <w:t xml:space="preserve">, </w:t>
       </w:r>
-      <w:hyperlink w:history="1" r:id="rIdthtadv00cm5c0nnxnby3l">
+      <w:hyperlink w:history="1" r:id="rIdkruop7erftjg8age--glj">
         <w:r>
           <w:rPr>
             <w:color w:val="EA2E00"/>
@@ -1622,7 +1622,7 @@
         </w:rPr>
         <w:t xml:space="preserve">, </w:t>
       </w:r>
-      <w:hyperlink w:history="1" r:id="rIdkgh__mhd5acr4zdf_qimy">
+      <w:hyperlink w:history="1" r:id="rIddcvn9ipescf5xhbusjn46">
         <w:r>
           <w:rPr>
             <w:color w:val="EA2E00"/>
@@ -1640,7 +1640,7 @@
         </w:rPr>
         <w:t xml:space="preserve">, </w:t>
       </w:r>
-      <w:hyperlink w:history="1" r:id="rIdyvu8dkpjmmnj9f1mr8wba">
+      <w:hyperlink w:history="1" r:id="rIdvt0p7hjp8ynnqiga7eoai">
         <w:r>
           <w:rPr>
             <w:color w:val="EA2E00"/>
@@ -1658,7 +1658,7 @@
         </w:rPr>
         <w:t xml:space="preserve">, </w:t>
       </w:r>
-      <w:hyperlink w:history="1" r:id="rIdtplchqkjwub1dkhukgh5r">
+      <w:hyperlink w:history="1" r:id="rIdbtkprupi4om3dsp0vmsmk">
         <w:r>
           <w:rPr>
             <w:color w:val="EA2E00"/>
@@ -1720,7 +1720,7 @@
       </w:r>
     </w:p>
     <w:p>
-      <w:hyperlink w:history="1" r:id="rIdy7on5ppy4thneenhixaay">
+      <w:hyperlink w:history="1" r:id="rIdhhebn3ha3vyex3s-tfoce">
         <w:r>
           <w:rPr>
             <w:rStyle w:val="Hyperlink"/>
@@ -1741,7 +1741,7 @@
         </w:rPr>
         <w:t xml:space="preserve">Via </w:t>
       </w:r>
-      <w:hyperlink w:history="1" r:id="rIda8w0wu1k_firfthdir54c">
+      <w:hyperlink w:history="1" r:id="rIdqvgms6ftpnnvioryyfboc">
         <w:r>
           <w:rPr>
             <w:color w:val="EA2E00"/>
@@ -1759,7 +1759,7 @@
         </w:rPr>
         <w:t xml:space="preserve">, </w:t>
       </w:r>
-      <w:hyperlink w:history="1" r:id="rId_ysv7kt-5oygmpr15k7uz">
+      <w:hyperlink w:history="1" r:id="rIdjsdhhip1hienhss3zqy9o">
         <w:r>
           <w:rPr>
             <w:color w:val="EA2E00"/>
@@ -1777,7 +1777,7 @@
         </w:rPr>
         <w:t xml:space="preserve">, </w:t>
       </w:r>
-      <w:hyperlink w:history="1" r:id="rIdvp6wwcgrmuiuirofh9_qv">
+      <w:hyperlink w:history="1" r:id="rIdqlirgql17wq4xuwajvo1o">
         <w:r>
           <w:rPr>
             <w:color w:val="EA2E00"/>
@@ -1795,7 +1795,7 @@
         </w:rPr>
         <w:t xml:space="preserve">, </w:t>
       </w:r>
-      <w:hyperlink w:history="1" r:id="rId-vagbqud1jx1t-qkxqhqo">
+      <w:hyperlink w:history="1" r:id="rIdaloti63jskvgfw17iaibr">
         <w:r>
           <w:rPr>
             <w:color w:val="EA2E00"/>
@@ -1813,7 +1813,7 @@
         </w:rPr>
         <w:t xml:space="preserve">, </w:t>
       </w:r>
-      <w:hyperlink w:history="1" r:id="rIdy0y3u0qmriespccdct1ai">
+      <w:hyperlink w:history="1" r:id="rIdb-s5siegmumo99uk5nu-o">
         <w:r>
           <w:rPr>
             <w:color w:val="EA2E00"/>
@@ -1875,7 +1875,7 @@
       </w:r>
     </w:p>
     <w:p>
-      <w:hyperlink w:history="1" r:id="rIdiq-rt_uekf4ovee9zz0ut">
+      <w:hyperlink w:history="1" r:id="rIdnbjbsc_bljvgj5vbom1bj">
         <w:r>
           <w:rPr>
             <w:rStyle w:val="Hyperlink"/>
@@ -1896,7 +1896,7 @@
         </w:rPr>
         <w:t xml:space="preserve">Via </w:t>
       </w:r>
-      <w:hyperlink w:history="1" r:id="rIdum_zr0ma_jhxeca4eiyjj">
+      <w:hyperlink w:history="1" r:id="rId0wqpvezu4--oiopag-g61">
         <w:r>
           <w:rPr>
             <w:color w:val="EA2E00"/>
@@ -1914,7 +1914,7 @@
         </w:rPr>
         <w:t xml:space="preserve">, </w:t>
       </w:r>
-      <w:hyperlink w:history="1" r:id="rId4l5plavb8jta398c4rabm">
+      <w:hyperlink w:history="1" r:id="rIdsazs6rilquyy6nuse2er-">
         <w:r>
           <w:rPr>
             <w:color w:val="EA2E00"/>
@@ -1976,7 +1976,7 @@
       </w:r>
     </w:p>
     <w:p>
-      <w:hyperlink w:history="1" r:id="rIdrck3modejbpllsijrmy4v">
+      <w:hyperlink w:history="1" r:id="rId4mjuubtibwh7v9ta9yc90">
         <w:r>
           <w:rPr>
             <w:rStyle w:val="Hyperlink"/>
@@ -1997,7 +1997,7 @@
         </w:rPr>
         <w:t xml:space="preserve">Via </w:t>
       </w:r>
-      <w:hyperlink w:history="1" r:id="rIdrun4bhnnowrl5hi63j8ac">
+      <w:hyperlink w:history="1" r:id="rId_c0wlwsdhr8ps3uiakouv">
         <w:r>
           <w:rPr>
             <w:color w:val="EA2E00"/>
@@ -2015,7 +2015,7 @@
         </w:rPr>
         <w:t xml:space="preserve">, </w:t>
       </w:r>
-      <w:hyperlink w:history="1" r:id="rIdl2rvdkcdcmf6qb8pxhlmo">
+      <w:hyperlink w:history="1" r:id="rIdpxfklec5waksbgie7atdx">
         <w:r>
           <w:rPr>
             <w:color w:val="EA2E00"/>
@@ -2033,7 +2033,7 @@
         </w:rPr>
         <w:t xml:space="preserve">, </w:t>
       </w:r>
-      <w:hyperlink w:history="1" r:id="rIdxv3grpa-qek_hmybkfwey">
+      <w:hyperlink w:history="1" r:id="rId3lajnamapq5yqd00-5dgt">
         <w:r>
           <w:rPr>
             <w:color w:val="EA2E00"/>
@@ -2051,7 +2051,7 @@
         </w:rPr>
         <w:t xml:space="preserve">, </w:t>
       </w:r>
-      <w:hyperlink w:history="1" r:id="rIdz8cccmvrmaqsvbvlxtcww">
+      <w:hyperlink w:history="1" r:id="rIdvyrkhatzy1lczdnqwpfk_">
         <w:r>
           <w:rPr>
             <w:color w:val="EA2E00"/>
@@ -2113,7 +2113,7 @@
       </w:r>
     </w:p>
     <w:p>
-      <w:hyperlink w:history="1" r:id="rIdzmm9sldtwc1wdokfqakai">
+      <w:hyperlink w:history="1" r:id="rIdywjfspbyomimmcjfkl7tq">
         <w:r>
           <w:rPr>
             <w:rStyle w:val="Hyperlink"/>
@@ -2134,7 +2134,7 @@
         </w:rPr>
         <w:t xml:space="preserve">Via </w:t>
       </w:r>
-      <w:hyperlink w:history="1" r:id="rId4zwymh6nfwdjbqtxhpyeo">
+      <w:hyperlink w:history="1" r:id="rIdrbf4lhvzov9xch6gr-e6i">
         <w:r>
           <w:rPr>
             <w:color w:val="EA2E00"/>
@@ -2152,7 +2152,7 @@
         </w:rPr>
         <w:t xml:space="preserve">, </w:t>
       </w:r>
-      <w:hyperlink w:history="1" r:id="rIdnfytutzhwbc3sswb68jj8">
+      <w:hyperlink w:history="1" r:id="rIdfgfmem7ihqqfqflhgdjqj">
         <w:r>
           <w:rPr>
             <w:color w:val="EA2E00"/>
@@ -2214,7 +2214,7 @@
       </w:r>
     </w:p>
     <w:p>
-      <w:hyperlink w:history="1" r:id="rIdk9v1twmzail0wkcjkeqoc">
+      <w:hyperlink w:history="1" r:id="rIdx6c-4qnbnhncu6ubs5e-f">
         <w:r>
           <w:rPr>
             <w:rStyle w:val="Hyperlink"/>
@@ -2235,7 +2235,7 @@
         </w:rPr>
         <w:t xml:space="preserve">Via </w:t>
       </w:r>
-      <w:hyperlink w:history="1" r:id="rIdspecd3ztjxtcbadj8xexn">
+      <w:hyperlink w:history="1" r:id="rIdmmgoccvwdat7vci-r5u-0">
         <w:r>
           <w:rPr>
             <w:color w:val="EA2E00"/>
@@ -2253,7 +2253,7 @@
         </w:rPr>
         <w:t xml:space="preserve">, </w:t>
       </w:r>
-      <w:hyperlink w:history="1" r:id="rIdg6rd1l4h24hudgkqmaol6">
+      <w:hyperlink w:history="1" r:id="rIdfcugclexlhnnikdzkohtr">
         <w:r>
           <w:rPr>
             <w:color w:val="EA2E00"/>
@@ -2271,7 +2271,7 @@
         </w:rPr>
         <w:t xml:space="preserve">, </w:t>
       </w:r>
-      <w:hyperlink w:history="1" r:id="rIdv4enkfwktcabb0-gavjlj">
+      <w:hyperlink w:history="1" r:id="rIdzjhkipw_eyadwoijfuzpk">
         <w:r>
           <w:rPr>
             <w:color w:val="EA2E00"/>
@@ -2289,7 +2289,7 @@
         </w:rPr>
         <w:t xml:space="preserve">, </w:t>
       </w:r>
-      <w:hyperlink w:history="1" r:id="rId4lmh51lv2tdg_ygnoph6j">
+      <w:hyperlink w:history="1" r:id="rIdq-4tmuwzrezuamwed99op">
         <w:r>
           <w:rPr>
             <w:color w:val="EA2E00"/>
@@ -2351,7 +2351,7 @@
       </w:r>
     </w:p>
     <w:p>
-      <w:hyperlink w:history="1" r:id="rIddetfx-yqjxliirilu3_tl">
+      <w:hyperlink w:history="1" r:id="rIdpsd8ktpqztaer7m-y9tkt">
         <w:r>
           <w:rPr>
             <w:rStyle w:val="Hyperlink"/>
@@ -2372,7 +2372,7 @@
         </w:rPr>
         <w:t xml:space="preserve">Via </w:t>
       </w:r>
-      <w:hyperlink w:history="1" r:id="rIdzilwacvq53jzl6j1nmf5n">
+      <w:hyperlink w:history="1" r:id="rIdapmiljw6jsgaeytzbxt62">
         <w:r>
           <w:rPr>
             <w:color w:val="EA2E00"/>
@@ -2442,7 +2442,7 @@
       </w:r>
     </w:p>
     <w:p>
-      <w:hyperlink w:history="1" r:id="rId5kxfw-ttjcjohj8fenf90">
+      <w:hyperlink w:history="1" r:id="rIdfdbgmzxskmv_uytihdgfb">
         <w:r>
           <w:rPr>
             <w:rStyle w:val="Hyperlink"/>
@@ -2463,7 +2463,7 @@
         </w:rPr>
         <w:t xml:space="preserve">Via </w:t>
       </w:r>
-      <w:hyperlink w:history="1" r:id="rIdg0cp8jdp6yjiqc8yhpxu0">
+      <w:hyperlink w:history="1" r:id="rIdmmt5vdcq4wiqltpxhtgzk">
         <w:r>
           <w:rPr>
             <w:color w:val="EA2E00"/>
@@ -2525,7 +2525,7 @@
       </w:r>
     </w:p>
     <w:p>
-      <w:hyperlink w:history="1" r:id="rIdqjyncztcbnhfksq-vz1r_">
+      <w:hyperlink w:history="1" r:id="rId60h8ykiwaq9omremn5vcu">
         <w:r>
           <w:rPr>
             <w:rStyle w:val="Hyperlink"/>
@@ -2598,7 +2598,7 @@
       </w:r>
     </w:p>
     <w:p>
-      <w:hyperlink w:history="1" r:id="rIdtmrvuf92i_ylozmumnvxo">
+      <w:hyperlink w:history="1" r:id="rIdvcsef2vo8krun2lb65jia">
         <w:r>
           <w:rPr>
             <w:rStyle w:val="Hyperlink"/>
@@ -2619,7 +2619,7 @@
         </w:rPr>
         <w:t xml:space="preserve">Via </w:t>
       </w:r>
-      <w:hyperlink w:history="1" r:id="rId21cebha-otzdaqanl0qve">
+      <w:hyperlink w:history="1" r:id="rIdzxonmixope2ulanjrzum6">
         <w:r>
           <w:rPr>
             <w:color w:val="EA2E00"/>
@@ -2637,7 +2637,7 @@
         </w:rPr>
         <w:t xml:space="preserve">, </w:t>
       </w:r>
-      <w:hyperlink w:history="1" r:id="rIdt8zqvu0zaqt1j_lk4h-tx">
+      <w:hyperlink w:history="1" r:id="rIdwhq1pvedarw2esmfs8gan">
         <w:r>
           <w:rPr>
             <w:color w:val="EA2E00"/>
@@ -2655,7 +2655,7 @@
         </w:rPr>
         <w:t xml:space="preserve">, </w:t>
       </w:r>
-      <w:hyperlink w:history="1" r:id="rIdfvzajax0ck9mctkl2jd1p">
+      <w:hyperlink w:history="1" r:id="rIdbbo-l4orbanm1pv5q1mik">
         <w:r>
           <w:rPr>
             <w:color w:val="EA2E00"/>
@@ -2717,7 +2717,7 @@
       </w:r>
     </w:p>
     <w:p>
-      <w:hyperlink w:history="1" r:id="rIdms592wn9dsygsv_pyhppc">
+      <w:hyperlink w:history="1" r:id="rId3tsor39ijpww5_2cwaoxz">
         <w:r>
           <w:rPr>
             <w:rStyle w:val="Hyperlink"/>
@@ -2738,7 +2738,7 @@
         </w:rPr>
         <w:t xml:space="preserve">Via </w:t>
       </w:r>
-      <w:hyperlink w:history="1" r:id="rId6cuuckvyl0hq9uhozldy1">
+      <w:hyperlink w:history="1" r:id="rId7qwxeodbihaxedh0aw8fi">
         <w:r>
           <w:rPr>
             <w:color w:val="EA2E00"/>
@@ -2756,7 +2756,7 @@
         </w:rPr>
         <w:t xml:space="preserve">, </w:t>
       </w:r>
-      <w:hyperlink w:history="1" r:id="rId8ibqfxzyuueittpxppnjh">
+      <w:hyperlink w:history="1" r:id="rId_poaobyeft3avl9q2pgoj">
         <w:r>
           <w:rPr>
             <w:color w:val="EA2E00"/>
@@ -2818,7 +2818,7 @@
       </w:r>
     </w:p>
     <w:p>
-      <w:hyperlink w:history="1" r:id="rIdyzywvz4xcwydnutpy2dx_">
+      <w:hyperlink w:history="1" r:id="rIdwqdkevupeumbk4ztspd2g">
         <w:r>
           <w:rPr>
             <w:rStyle w:val="Hyperlink"/>
@@ -2839,7 +2839,7 @@
         </w:rPr>
         <w:t xml:space="preserve">Via </w:t>
       </w:r>
-      <w:hyperlink w:history="1" r:id="rIdosuah77u1yg1nuihuxxuz">
+      <w:hyperlink w:history="1" r:id="rIdcxl2vta_seclgp6gginpg">
         <w:r>
           <w:rPr>
             <w:color w:val="EA2E00"/>
@@ -2890,7 +2890,7 @@
         </w:rPr>
         <w:t xml:space="preserve">Via </w:t>
       </w:r>
-      <w:hyperlink w:history="1" r:id="rIdfdxxqm_g5xjz5lt1e0__o">
+      <w:hyperlink w:history="1" r:id="rIdep-oam4mdbrbak9jjouyg">
         <w:r>
           <w:rPr>
             <w:color w:val="EA2E00"/>
@@ -2908,7 +2908,7 @@
         </w:rPr>
         <w:t xml:space="preserve">, </w:t>
       </w:r>
-      <w:hyperlink w:history="1" r:id="rIdqsj83pyene_foqj98lmij">
+      <w:hyperlink w:history="1" r:id="rIdaa1wpjgp_op9_vtavzmni">
         <w:r>
           <w:rPr>
             <w:color w:val="EA2E00"/>
@@ -2926,7 +2926,7 @@
         </w:rPr>
         <w:t xml:space="preserve">, </w:t>
       </w:r>
-      <w:hyperlink w:history="1" r:id="rIdqpftsqsnxicmcad5yrgbo">
+      <w:hyperlink w:history="1" r:id="rIdkbpp5dk0fxkdyh57sqnrt">
         <w:r>
           <w:rPr>
             <w:color w:val="EA2E00"/>
@@ -2944,7 +2944,7 @@
         </w:rPr>
         <w:t xml:space="preserve">, </w:t>
       </w:r>
-      <w:hyperlink w:history="1" r:id="rId08lt3dlflhlsgzitjjiy9">
+      <w:hyperlink w:history="1" r:id="rId-27lrpxexbzcbaxtjgbp1">
         <w:r>
           <w:rPr>
             <w:color w:val="EA2E00"/>
@@ -2987,7 +2987,7 @@
         </w:rPr>
         <w:t xml:space="preserve">Via </w:t>
       </w:r>
-      <w:hyperlink w:history="1" r:id="rIdzvp2t6wmjbxegxdyuz5vb">
+      <w:hyperlink w:history="1" r:id="rIdhyf9d0iznsl3lcyqzas8y">
         <w:r>
           <w:rPr>
             <w:color w:val="EA2E00"/>
@@ -3005,7 +3005,7 @@
         </w:rPr>
         <w:t xml:space="preserve">, </w:t>
       </w:r>
-      <w:hyperlink w:history="1" r:id="rIdjpeyfkaisqav0fpplo8no">
+      <w:hyperlink w:history="1" r:id="rIdwccqfdfi7-3c6azh9m9ww">
         <w:r>
           <w:rPr>
             <w:color w:val="EA2E00"/>
@@ -3081,7 +3081,7 @@
         </w:rPr>
         <w:t xml:space="preserve">Via </w:t>
       </w:r>
-      <w:hyperlink w:history="1" r:id="rId0x5c7h5jokhpwxr_8x7l7">
+      <w:hyperlink w:history="1" r:id="rIddxqnmujc3igjgkyj1qlkb">
         <w:r>
           <w:rPr>
             <w:color w:val="EA2E00"/>
@@ -3099,7 +3099,7 @@
         </w:rPr>
         <w:t xml:space="preserve">, </w:t>
       </w:r>
-      <w:hyperlink w:history="1" r:id="rIdzp_2bxkjpemy_ey_bsau4">
+      <w:hyperlink w:history="1" r:id="rIduemokxnbkieb5llpsrtfg">
         <w:r>
           <w:rPr>
             <w:color w:val="EA2E00"/>
@@ -3117,7 +3117,7 @@
         </w:rPr>
         <w:t xml:space="preserve">, </w:t>
       </w:r>
-      <w:hyperlink w:history="1" r:id="rIdmwf-uqhaajvdcuzvw2jl-">
+      <w:hyperlink w:history="1" r:id="rIdnc-ic1liab6by1lvyt2bc">
         <w:r>
           <w:rPr>
             <w:color w:val="EA2E00"/>
@@ -3135,7 +3135,7 @@
         </w:rPr>
         <w:t xml:space="preserve">, </w:t>
       </w:r>
-      <w:hyperlink w:history="1" r:id="rIdusvm-_beh0u6cd_cjvyzp">
+      <w:hyperlink w:history="1" r:id="rIdxrhyutsht4szuze9wgaka">
         <w:r>
           <w:rPr>
             <w:color w:val="EA2E00"/>
@@ -3153,7 +3153,7 @@
         </w:rPr>
         <w:t xml:space="preserve">, </w:t>
       </w:r>
-      <w:hyperlink w:history="1" r:id="rIdxlhhbgvehel8oprasaeph">
+      <w:hyperlink w:history="1" r:id="rIdin8j09iodpwgp-ewedgal">
         <w:r>
           <w:rPr>
             <w:color w:val="EA2E00"/>
@@ -3196,7 +3196,7 @@
         </w:rPr>
         <w:t xml:space="preserve">Via </w:t>
       </w:r>
-      <w:hyperlink w:history="1" r:id="rIdhbtokn4qffwjsj8tzqjgl">
+      <w:hyperlink w:history="1" r:id="rIdezztspqxcpvwsoqfbust-">
         <w:r>
           <w:rPr>
             <w:color w:val="EA2E00"/>
@@ -3214,7 +3214,7 @@
         </w:rPr>
         <w:t xml:space="preserve">, </w:t>
       </w:r>
-      <w:hyperlink w:history="1" r:id="rIdbuuonk9ujusaraczq9mrm">
+      <w:hyperlink w:history="1" r:id="rId_7gnppebgjbpmqmbsqswe">
         <w:r>
           <w:rPr>
             <w:color w:val="EA2E00"/>
@@ -3232,7 +3232,7 @@
         </w:rPr>
         <w:t xml:space="preserve">, </w:t>
       </w:r>
-      <w:hyperlink w:history="1" r:id="rIdnc5y45dpdcduqms_iwkct">
+      <w:hyperlink w:history="1" r:id="rIdg70olgjk7_ues7yqgab_o">
         <w:r>
           <w:rPr>
             <w:color w:val="EA2E00"/>
@@ -3250,7 +3250,7 @@
         </w:rPr>
         <w:t xml:space="preserve">, </w:t>
       </w:r>
-      <w:hyperlink w:history="1" r:id="rIdpzufxyiozuivpgim9_upt">
+      <w:hyperlink w:history="1" r:id="rIdwq60rsavwdjpfruxl7vhl">
         <w:r>
           <w:rPr>
             <w:color w:val="EA2E00"/>
@@ -3398,7 +3398,7 @@
             </w:r>
           </w:p>
           <w:p>
-            <w:hyperlink w:history="1" r:id="rIdtdff_toozsn0_ain6hjhj">
+            <w:hyperlink w:history="1" r:id="rIdgoxputpefgar6g8btnpfl">
               <w:r>
                 <w:rPr>
                   <w:rStyle w:val="Hyperlink"/>
@@ -5006,7 +5006,7 @@
         </w:rPr>
         <w:t xml:space="preserve">Via </w:t>
       </w:r>
-      <w:hyperlink w:history="1" r:id="rIdpfqzeng-mof9lmiamvxgi">
+      <w:hyperlink w:history="1" r:id="rIdwhrgjmbno_c-jjqk6uw_s">
         <w:r>
           <w:rPr>
             <w:color w:val="EA2E00"/>
@@ -5024,7 +5024,7 @@
         </w:rPr>
         <w:t xml:space="preserve">, </w:t>
       </w:r>
-      <w:hyperlink w:history="1" r:id="rIdxlg0ucug_xevs_v-5m5wu">
+      <w:hyperlink w:history="1" r:id="rIdamoi35berj4ftnsb-90k2">
         <w:r>
           <w:rPr>
             <w:color w:val="EA2E00"/>
@@ -5042,7 +5042,7 @@
         </w:rPr>
         <w:t xml:space="preserve">, </w:t>
       </w:r>
-      <w:hyperlink w:history="1" r:id="rIdlsluvtfuz_j-kvjg0-ug_">
+      <w:hyperlink w:history="1" r:id="rIdimi6sdyq2jw5osw91zehc">
         <w:r>
           <w:rPr>
             <w:color w:val="EA2E00"/>
@@ -5060,7 +5060,7 @@
         </w:rPr>
         <w:t xml:space="preserve">, </w:t>
       </w:r>
-      <w:hyperlink w:history="1" r:id="rIdn1bxj453xwnooopuji8do">
+      <w:hyperlink w:history="1" r:id="rIdkspocreikzd3rmzi4bb3y">
         <w:r>
           <w:rPr>
             <w:color w:val="EA2E00"/>
@@ -5118,7 +5118,7 @@
         </w:rPr>
         <w:t xml:space="preserve">Via </w:t>
       </w:r>
-      <w:hyperlink w:history="1" r:id="rIduytrm46goo9sesxfnmylx">
+      <w:hyperlink w:history="1" r:id="rIdu9swn3pbxs_6q9hl4tzn4">
         <w:r>
           <w:rPr>
             <w:color w:val="EA2E00"/>
@@ -5136,7 +5136,7 @@
         </w:rPr>
         <w:t xml:space="preserve">, </w:t>
       </w:r>
-      <w:hyperlink w:history="1" r:id="rIdoyoy0vws7l_taqotr9i2l">
+      <w:hyperlink w:history="1" r:id="rIdrkrm_oen_qhxm72ksgqqs">
         <w:r>
           <w:rPr>
             <w:color w:val="EA2E00"/>
@@ -5194,7 +5194,7 @@
         </w:rPr>
         <w:t xml:space="preserve">Via </w:t>
       </w:r>
-      <w:hyperlink w:history="1" r:id="rIdod-hphqvk99ysgd6kmc59">
+      <w:hyperlink w:history="1" r:id="rIdxcl7ipf3ej8oo78ourwtn">
         <w:r>
           <w:rPr>
             <w:color w:val="EA2E00"/>
@@ -5212,7 +5212,7 @@
         </w:rPr>
         <w:t xml:space="preserve">, </w:t>
       </w:r>
-      <w:hyperlink w:history="1" r:id="rIdnokonvv-h693_eugcyb5m">
+      <w:hyperlink w:history="1" r:id="rIdexopgr9f2nx8_qgofyloh">
         <w:r>
           <w:rPr>
             <w:color w:val="EA2E00"/>
@@ -5318,7 +5318,7 @@
         </w:rPr>
         <w:t xml:space="preserve">Via </w:t>
       </w:r>
-      <w:hyperlink w:history="1" r:id="rIdedqwtqq8elcvpe5zeychn">
+      <w:hyperlink w:history="1" r:id="rIdhl6dlwo9qei6g1uxg3vn3">
         <w:r>
           <w:rPr>
             <w:color w:val="EA2E00"/>
@@ -5336,7 +5336,7 @@
         </w:rPr>
         <w:t xml:space="preserve">, </w:t>
       </w:r>
-      <w:hyperlink w:history="1" r:id="rIdbayvpmzx-7_yqo5jwtb6t">
+      <w:hyperlink w:history="1" r:id="rIdxknbsntwvx91obvjd0pik">
         <w:r>
           <w:rPr>
             <w:color w:val="EA2E00"/>
@@ -5394,7 +5394,7 @@
         </w:rPr>
         <w:t xml:space="preserve">Via </w:t>
       </w:r>
-      <w:hyperlink w:history="1" r:id="rIdhm7zsr-mv9i7kjx66rivm">
+      <w:hyperlink w:history="1" r:id="rIduxxs3vp_zqifv8fig6an9">
         <w:r>
           <w:rPr>
             <w:color w:val="EA2E00"/>
@@ -5412,7 +5412,7 @@
         </w:rPr>
         <w:t xml:space="preserve">, </w:t>
       </w:r>
-      <w:hyperlink w:history="1" r:id="rIdrxmy-4lflls9k9ra5jpjr">
+      <w:hyperlink w:history="1" r:id="rIdaivonxptgx84ibrqu7yng">
         <w:r>
           <w:rPr>
             <w:color w:val="EA2E00"/>
@@ -5430,7 +5430,7 @@
         </w:rPr>
         <w:t xml:space="preserve">, </w:t>
       </w:r>
-      <w:hyperlink w:history="1" r:id="rId3sqdjbemuuahvsgturfrd">
+      <w:hyperlink w:history="1" r:id="rIdfsqovu96p_8ybbpv-bi05">
         <w:r>
           <w:rPr>
             <w:color w:val="EA2E00"/>
@@ -5448,7 +5448,7 @@
         </w:rPr>
         <w:t xml:space="preserve">, </w:t>
       </w:r>
-      <w:hyperlink w:history="1" r:id="rIdrydt_0yfj4t4obblnk3sy">
+      <w:hyperlink w:history="1" r:id="rIdc6ia_3aqlhyb9s85ji3-o">
         <w:r>
           <w:rPr>
             <w:color w:val="EA2E00"/>
@@ -5466,7 +5466,7 @@
         </w:rPr>
         <w:t xml:space="preserve">, </w:t>
       </w:r>
-      <w:hyperlink w:history="1" r:id="rId3rcwtvthwyah2pyxtql1p">
+      <w:hyperlink w:history="1" r:id="rIdymqijkgy1xzfhadqqw_6v">
         <w:r>
           <w:rPr>
             <w:color w:val="EA2E00"/>
@@ -5524,7 +5524,7 @@
         </w:rPr>
         <w:t xml:space="preserve">Via </w:t>
       </w:r>
-      <w:hyperlink w:history="1" r:id="rIdsu0covtpks2mnrdit92_1">
+      <w:hyperlink w:history="1" r:id="rId7zatfby8l7ob5uv7mvnsl">
         <w:r>
           <w:rPr>
             <w:color w:val="EA2E00"/>
@@ -5542,7 +5542,7 @@
         </w:rPr>
         <w:t xml:space="preserve">, </w:t>
       </w:r>
-      <w:hyperlink w:history="1" r:id="rIdom8xuc8_td9qclb-g83ux">
+      <w:hyperlink w:history="1" r:id="rIdmquqdr1doq-63ncpcgdmb">
         <w:r>
           <w:rPr>
             <w:color w:val="EA2E00"/>
@@ -5560,7 +5560,7 @@
         </w:rPr>
         <w:t xml:space="preserve">, </w:t>
       </w:r>
-      <w:hyperlink w:history="1" r:id="rIdcdm6-awv1jxxxg3yqtnkn">
+      <w:hyperlink w:history="1" r:id="rIdscqn35sc1uopp2aprrtqk">
         <w:r>
           <w:rPr>
             <w:color w:val="EA2E00"/>
@@ -5578,7 +5578,7 @@
         </w:rPr>
         <w:t xml:space="preserve">, </w:t>
       </w:r>
-      <w:hyperlink w:history="1" r:id="rIdfeukeify5yb_0zrsujpqc">
+      <w:hyperlink w:history="1" r:id="rIdktn40oqxjus_j2vsi_xj-">
         <w:r>
           <w:rPr>
             <w:color w:val="EA2E00"/>
@@ -5642,7 +5642,7 @@
             </w:r>
           </w:p>
           <w:p>
-            <w:hyperlink w:history="1" r:id="rIdt0i72-q51wfsifikq3vea">
+            <w:hyperlink w:history="1" r:id="rIdgoyby3ukjcmj8ksk87ddb">
               <w:r>
                 <w:rPr>
                   <w:rStyle w:val="Hyperlink"/>
@@ -5694,7 +5694,7 @@
         </w:rPr>
         <w:t xml:space="preserve">Via </w:t>
       </w:r>
-      <w:hyperlink w:history="1" r:id="rIdhwy7yigmu7upqkqxxa2oz">
+      <w:hyperlink w:history="1" r:id="rIdfj61dfptmozt3pwiy1mfn">
         <w:r>
           <w:rPr>
             <w:color w:val="EA2E00"/>
@@ -5712,7 +5712,7 @@
         </w:rPr>
         <w:t xml:space="preserve">, </w:t>
       </w:r>
-      <w:hyperlink w:history="1" r:id="rId1fkv9rpv1xsd8e6pobtvo">
+      <w:hyperlink w:history="1" r:id="rIdtcjfb0sgs7snrbevop27x">
         <w:r>
           <w:rPr>
             <w:color w:val="EA2E00"/>
@@ -5730,7 +5730,7 @@
         </w:rPr>
         <w:t xml:space="preserve">, </w:t>
       </w:r>
-      <w:hyperlink w:history="1" r:id="rIdgaf0k3r2bzy6gf00vfkas">
+      <w:hyperlink w:history="1" r:id="rIdvwozbjecbkdd61nzku76y">
         <w:r>
           <w:rPr>
             <w:color w:val="EA2E00"/>
@@ -5748,7 +5748,7 @@
         </w:rPr>
         <w:t xml:space="preserve">, </w:t>
       </w:r>
-      <w:hyperlink w:history="1" r:id="rId0phznooqr5plp-is6qmss">
+      <w:hyperlink w:history="1" r:id="rIdrdxbjamxsoiju1ip7ni8u">
         <w:r>
           <w:rPr>
             <w:color w:val="EA2E00"/>
@@ -5791,7 +5791,7 @@
         </w:rPr>
         <w:t xml:space="preserve">Via </w:t>
       </w:r>
-      <w:hyperlink w:history="1" r:id="rIdhfwurzyv66veunoaxoalh">
+      <w:hyperlink w:history="1" r:id="rIdjknr6myhtbrzovysxn6lf">
         <w:r>
           <w:rPr>
             <w:color w:val="EA2E00"/>
@@ -5834,7 +5834,7 @@
         </w:rPr>
         <w:t xml:space="preserve">Via </w:t>
       </w:r>
-      <w:hyperlink w:history="1" r:id="rIduyg7z_iz0c5hf66isca3j">
+      <w:hyperlink w:history="1" r:id="rIdhfxp3mfo8yqkzxjp2mwsq">
         <w:r>
           <w:rPr>
             <w:color w:val="EA2E00"/>
@@ -5852,7 +5852,7 @@
         </w:rPr>
         <w:t xml:space="preserve">, </w:t>
       </w:r>
-      <w:hyperlink w:history="1" r:id="rIdsdzfmzalgpjy4mcabp6m9">
+      <w:hyperlink w:history="1" r:id="rIdvagenqwbimtl9d2olwl4f">
         <w:r>
           <w:rPr>
             <w:color w:val="EA2E00"/>
@@ -5895,7 +5895,7 @@
         </w:rPr>
         <w:t xml:space="preserve">Via </w:t>
       </w:r>
-      <w:hyperlink w:history="1" r:id="rId-hwqsgg58igvfkueqvgde">
+      <w:hyperlink w:history="1" r:id="rId0_g8pajivmoyrjn3opaxi">
         <w:r>
           <w:rPr>
             <w:color w:val="EA2E00"/>
@@ -5913,7 +5913,7 @@
         </w:rPr>
         <w:t xml:space="preserve">, </w:t>
       </w:r>
-      <w:hyperlink w:history="1" r:id="rIdydbcw2thmj6ym4jdzo2sk">
+      <w:hyperlink w:history="1" r:id="rIduqzilx24lpxqw4rzn_4dj">
         <w:r>
           <w:rPr>
             <w:color w:val="EA2E00"/>
@@ -5931,7 +5931,7 @@
         </w:rPr>
         <w:t xml:space="preserve">, </w:t>
       </w:r>
-      <w:hyperlink w:history="1" r:id="rIdkdoh2g8_lihnapogdbqxe">
+      <w:hyperlink w:history="1" r:id="rIdpypfxvr3zxbnessfkc4pb">
         <w:r>
           <w:rPr>
             <w:color w:val="EA2E00"/>
@@ -5974,7 +5974,7 @@
         </w:rPr>
         <w:t xml:space="preserve">Via </w:t>
       </w:r>
-      <w:hyperlink w:history="1" r:id="rIdp85ol1zrsylmxavyjmdni">
+      <w:hyperlink w:history="1" r:id="rIdj4apuo1h1xodtafhvtqb9">
         <w:r>
           <w:rPr>
             <w:color w:val="EA2E00"/>
@@ -5992,7 +5992,7 @@
         </w:rPr>
         <w:t xml:space="preserve">, </w:t>
       </w:r>
-      <w:hyperlink w:history="1" r:id="rId8bexnwwsx9z3rziq6zv9w">
+      <w:hyperlink w:history="1" r:id="rIdllxp02skwfpd9pw6b-avf">
         <w:r>
           <w:rPr>
             <w:color w:val="EA2E00"/>
@@ -6035,7 +6035,7 @@
         </w:rPr>
         <w:t xml:space="preserve">Via </w:t>
       </w:r>
-      <w:hyperlink w:history="1" r:id="rIdteajvwswz1ct06zz_i5nz">
+      <w:hyperlink w:history="1" r:id="rIdeaw6vhtg5myisowelygyv">
         <w:r>
           <w:rPr>
             <w:color w:val="EA2E00"/>
@@ -6053,7 +6053,7 @@
         </w:rPr>
         <w:t xml:space="preserve">, </w:t>
       </w:r>
-      <w:hyperlink w:history="1" r:id="rId6kep8fwkmkzsl434agla8">
+      <w:hyperlink w:history="1" r:id="rIdnz_a7gglvpptrvgiq-gzu">
         <w:r>
           <w:rPr>
             <w:color w:val="EA2E00"/>
@@ -6071,7 +6071,7 @@
         </w:rPr>
         <w:t xml:space="preserve">, </w:t>
       </w:r>
-      <w:hyperlink w:history="1" r:id="rId0r9gs0pvrsu-onnbv9trn">
+      <w:hyperlink w:history="1" r:id="rId_jivq30spmbvldgkjzakh">
         <w:r>
           <w:rPr>
             <w:color w:val="EA2E00"/>
@@ -6169,7 +6169,7 @@
         </w:rPr>
         <w:t xml:space="preserve">Via </w:t>
       </w:r>
-      <w:hyperlink w:history="1" r:id="rId2iq1bzqdgxrutajqekmbo">
+      <w:hyperlink w:history="1" r:id="rIdihixkb0kc_c6t17bbusq0">
         <w:r>
           <w:rPr>
             <w:color w:val="EA2E00"/>
@@ -6187,7 +6187,7 @@
         </w:rPr>
         <w:t xml:space="preserve">, </w:t>
       </w:r>
-      <w:hyperlink w:history="1" r:id="rIdpunn6mloahzcieavuwq5j">
+      <w:hyperlink w:history="1" r:id="rIdsf3bvqvluduxlgzfkmpee">
         <w:r>
           <w:rPr>
             <w:color w:val="EA2E00"/>
@@ -6205,7 +6205,7 @@
         </w:rPr>
         <w:t xml:space="preserve">, </w:t>
       </w:r>
-      <w:hyperlink w:history="1" r:id="rIdinz6k4_etgw2i_bzia941">
+      <w:hyperlink w:history="1" r:id="rIdbcg7o0gmc3vi0cxw-3s0m">
         <w:r>
           <w:rPr>
             <w:color w:val="EA2E00"/>
@@ -6223,7 +6223,7 @@
         </w:rPr>
         <w:t xml:space="preserve">, </w:t>
       </w:r>
-      <w:hyperlink w:history="1" r:id="rIdnqjskxjhi9ml20qlwr5lk">
+      <w:hyperlink w:history="1" r:id="rIdb7vgtha-8q5ymetnsyyla">
         <w:r>
           <w:rPr>
             <w:color w:val="EA2E00"/>
@@ -6241,7 +6241,7 @@
         </w:rPr>
         <w:t xml:space="preserve">, </w:t>
       </w:r>
-      <w:hyperlink w:history="1" r:id="rIdekw1wn2m2_jjtsbh3fn8m">
+      <w:hyperlink w:history="1" r:id="rIdywcxkco4f1obh_mctyzwq">
         <w:r>
           <w:rPr>
             <w:color w:val="EA2E00"/>
@@ -6259,7 +6259,7 @@
         </w:rPr>
         <w:t xml:space="preserve">, </w:t>
       </w:r>
-      <w:hyperlink w:history="1" r:id="rIdijxbmduqnoslnppd5s95i">
+      <w:hyperlink w:history="1" r:id="rIdpyspigxcahjzfxlqihdbu">
         <w:r>
           <w:rPr>
             <w:color w:val="EA2E00"/>
@@ -6277,7 +6277,7 @@
         </w:rPr>
         <w:t xml:space="preserve">, </w:t>
       </w:r>
-      <w:hyperlink w:history="1" r:id="rIdj1ko-utmyom5jwwqrbdrj">
+      <w:hyperlink w:history="1" r:id="rIdkn5hno6q9fy2mp_1-zkrg">
         <w:r>
           <w:rPr>
             <w:color w:val="EA2E00"/>
@@ -6338,7 +6338,7 @@
         </w:rPr>
         <w:t xml:space="preserve">Via </w:t>
       </w:r>
-      <w:hyperlink w:history="1" r:id="rIdq2by30jhgbsxwkngcxq54">
+      <w:hyperlink w:history="1" r:id="rId2vysgbjyj94uilqjbszy-">
         <w:r>
           <w:rPr>
             <w:color w:val="EA2E00"/>
@@ -6356,7 +6356,7 @@
         </w:rPr>
         <w:t xml:space="preserve">, </w:t>
       </w:r>
-      <w:hyperlink w:history="1" r:id="rIddn-ifknjm3oq-eqc8zfbf">
+      <w:hyperlink w:history="1" r:id="rId0hwcyjcqk0wjezbcnuvri">
         <w:r>
           <w:rPr>
             <w:color w:val="EA2E00"/>
@@ -6374,7 +6374,7 @@
         </w:rPr>
         <w:t xml:space="preserve">, </w:t>
       </w:r>
-      <w:hyperlink w:history="1" r:id="rIdxmpuh6lbpqhpsxvfnklnr">
+      <w:hyperlink w:history="1" r:id="rIdgp6k_jcl7_hztb7wyfnn-">
         <w:r>
           <w:rPr>
             <w:color w:val="EA2E00"/>
@@ -6392,7 +6392,7 @@
         </w:rPr>
         <w:t xml:space="preserve">, </w:t>
       </w:r>
-      <w:hyperlink w:history="1" r:id="rIddchs0qblclycmq3nwj2tz">
+      <w:hyperlink w:history="1" r:id="rIdg3eco1irdt2vsgypeljbm">
         <w:r>
           <w:rPr>
             <w:color w:val="EA2E00"/>
@@ -6453,7 +6453,7 @@
         </w:rPr>
         <w:t xml:space="preserve">Via </w:t>
       </w:r>
-      <w:hyperlink w:history="1" r:id="rId1y_iiqlbumnqdhiy2gu-k">
+      <w:hyperlink w:history="1" r:id="rIdl6fdx0mkpm7dnpsojkp7t">
         <w:r>
           <w:rPr>
             <w:color w:val="EA2E00"/>
@@ -6471,7 +6471,7 @@
         </w:rPr>
         <w:t xml:space="preserve">, </w:t>
       </w:r>
-      <w:hyperlink w:history="1" r:id="rIdqsti3madhpiwifewu8bfu">
+      <w:hyperlink w:history="1" r:id="rIdr9h7rbrb7tw5ldl-jf7dm">
         <w:r>
           <w:rPr>
             <w:color w:val="EA2E00"/>
@@ -6489,7 +6489,7 @@
         </w:rPr>
         <w:t xml:space="preserve">, </w:t>
       </w:r>
-      <w:hyperlink w:history="1" r:id="rIdgcxqt6nfoxnfztw5ws_c0">
+      <w:hyperlink w:history="1" r:id="rIdxugx1wkqofiy9-ku8pphi">
         <w:r>
           <w:rPr>
             <w:color w:val="EA2E00"/>
@@ -6507,7 +6507,7 @@
         </w:rPr>
         <w:t xml:space="preserve">, </w:t>
       </w:r>
-      <w:hyperlink w:history="1" r:id="rIdwp_tf108wnuvin0xlrcc_">
+      <w:hyperlink w:history="1" r:id="rIdwrbydcb4mbpofygfdtevj">
         <w:r>
           <w:rPr>
             <w:color w:val="EA2E00"/>
@@ -6525,7 +6525,7 @@
         </w:rPr>
         <w:t xml:space="preserve">, </w:t>
       </w:r>
-      <w:hyperlink w:history="1" r:id="rId7prvewhaaadvswxduioyu">
+      <w:hyperlink w:history="1" r:id="rIddlwjfz3blk75jaaocdh2f">
         <w:r>
           <w:rPr>
             <w:color w:val="EA2E00"/>
@@ -6586,7 +6586,7 @@
         </w:rPr>
         <w:t xml:space="preserve">Via </w:t>
       </w:r>
-      <w:hyperlink w:history="1" r:id="rIdibh7stba-y-gki1l_ig2a">
+      <w:hyperlink w:history="1" r:id="rIdookpqmmoounpufngc8abl">
         <w:r>
           <w:rPr>
             <w:color w:val="EA2E00"/>
@@ -6604,7 +6604,7 @@
         </w:rPr>
         <w:t xml:space="preserve">, </w:t>
       </w:r>
-      <w:hyperlink w:history="1" r:id="rIdpyigpqtrowhjzflni21wr">
+      <w:hyperlink w:history="1" r:id="rIdlgghzflqvu0nv8xllexhb">
         <w:r>
           <w:rPr>
             <w:color w:val="EA2E00"/>
@@ -6622,7 +6622,7 @@
         </w:rPr>
         <w:t xml:space="preserve">, </w:t>
       </w:r>
-      <w:hyperlink w:history="1" r:id="rId7layndjzm2rp6qx_e7ky6">
+      <w:hyperlink w:history="1" r:id="rIdamiquogcnjz-qbjbb-fnz">
         <w:r>
           <w:rPr>
             <w:color w:val="EA2E00"/>
@@ -6640,7 +6640,7 @@
         </w:rPr>
         <w:t xml:space="preserve">, </w:t>
       </w:r>
-      <w:hyperlink w:history="1" r:id="rId1j0h4fyy3jhicwgscsmst">
+      <w:hyperlink w:history="1" r:id="rIdup4r3qm0pcdwytlmguwrr">
         <w:r>
           <w:rPr>
             <w:color w:val="EA2E00"/>
@@ -6658,7 +6658,7 @@
         </w:rPr>
         <w:t xml:space="preserve">, </w:t>
       </w:r>
-      <w:hyperlink w:history="1" r:id="rIdfwxpdol9uotiy695rqr1y">
+      <w:hyperlink w:history="1" r:id="rIdt8hlif8a94827a8hnypbd">
         <w:r>
           <w:rPr>
             <w:color w:val="EA2E00"/>
@@ -6676,7 +6676,7 @@
         </w:rPr>
         <w:t xml:space="preserve">, </w:t>
       </w:r>
-      <w:hyperlink w:history="1" r:id="rIdttdzfhc9yxqu0lybji1t9">
+      <w:hyperlink w:history="1" r:id="rIdl-tliglak4tbszepx-i0l">
         <w:r>
           <w:rPr>
             <w:color w:val="EA2E00"/>
@@ -6694,7 +6694,7 @@
         </w:rPr>
         <w:t xml:space="preserve">, </w:t>
       </w:r>
-      <w:hyperlink w:history="1" r:id="rIdhtimewcfwpgjm_zwmjbtl">
+      <w:hyperlink w:history="1" r:id="rIdnv52zhe0crbwaeoprnycp">
         <w:r>
           <w:rPr>
             <w:color w:val="EA2E00"/>
@@ -6755,7 +6755,7 @@
         </w:rPr>
         <w:t xml:space="preserve">Via </w:t>
       </w:r>
-      <w:hyperlink w:history="1" r:id="rId5camqe38w4_gm8jcgyrhl">
+      <w:hyperlink w:history="1" r:id="rIdavia0eflgcqyjy3ipe8cv">
         <w:r>
           <w:rPr>
             <w:color w:val="EA2E00"/>
@@ -6773,7 +6773,7 @@
         </w:rPr>
         <w:t xml:space="preserve">, </w:t>
       </w:r>
-      <w:hyperlink w:history="1" r:id="rIdurmh5wh901q90yxihzhnf">
+      <w:hyperlink w:history="1" r:id="rIdhrtome4ad5ltryd5o3ayh">
         <w:r>
           <w:rPr>
             <w:color w:val="EA2E00"/>
@@ -6791,7 +6791,7 @@
         </w:rPr>
         <w:t xml:space="preserve">, </w:t>
       </w:r>
-      <w:hyperlink w:history="1" r:id="rId39gowlkoapu17sw4n6cmr">
+      <w:hyperlink w:history="1" r:id="rIdaoapzi5lfeocjn5x3i3az">
         <w:r>
           <w:rPr>
             <w:color w:val="EA2E00"/>
@@ -6809,7 +6809,7 @@
         </w:rPr>
         <w:t xml:space="preserve">, </w:t>
       </w:r>
-      <w:hyperlink w:history="1" r:id="rIdbdiqof2eht_k9gc4yk4es">
+      <w:hyperlink w:history="1" r:id="rIdddomaf6nurixktfljksnb">
         <w:r>
           <w:rPr>
             <w:color w:val="EA2E00"/>
@@ -6870,7 +6870,7 @@
         </w:rPr>
         <w:t xml:space="preserve">Via </w:t>
       </w:r>
-      <w:hyperlink w:history="1" r:id="rIdf7kqdono3mfaprwbj9zte">
+      <w:hyperlink w:history="1" r:id="rIdnvh7gknwysczfcmwa3j31">
         <w:r>
           <w:rPr>
             <w:color w:val="EA2E00"/>
@@ -6888,7 +6888,7 @@
         </w:rPr>
         <w:t xml:space="preserve">, </w:t>
       </w:r>
-      <w:hyperlink w:history="1" r:id="rIdb62ykngarhb07f6zfvmr_">
+      <w:hyperlink w:history="1" r:id="rId5lesqv-2hopmh-ucb3hxf">
         <w:r>
           <w:rPr>
             <w:color w:val="EA2E00"/>
@@ -6906,7 +6906,7 @@
         </w:rPr>
         <w:t xml:space="preserve">, </w:t>
       </w:r>
-      <w:hyperlink w:history="1" r:id="rIdjf6o-1bw21vmouujfecxx">
+      <w:hyperlink w:history="1" r:id="rIdzz8sb5ctu6gk_xsdmduz5">
         <w:r>
           <w:rPr>
             <w:color w:val="EA2E00"/>
@@ -7189,7 +7189,7 @@
             </w:tcMar>
           </w:tcPr>
           <w:p>
-            <w:hyperlink w:history="1" r:id="rId5mup4ue7bt5yx79dfz4q3">
+            <w:hyperlink w:history="1" r:id="rIdv9qskjafh2y3o0qwwkj0a">
               <w:r>
                 <w:rPr>
                   <w:rStyle w:val="Hyperlink"/>
@@ -7308,7 +7308,7 @@
             </w:tcMar>
           </w:tcPr>
           <w:p>
-            <w:hyperlink w:history="1" r:id="rIdvdyhkjymuholday-lcgy0">
+            <w:hyperlink w:history="1" r:id="rIdj18jwwpn7zcdwszb0m7fw">
               <w:r>
                 <w:rPr>
                   <w:rStyle w:val="Hyperlink"/>
@@ -7427,7 +7427,7 @@
             </w:tcMar>
           </w:tcPr>
           <w:p>
-            <w:hyperlink w:history="1" r:id="rIdmuwxtwcoajlcff2jmm1wc">
+            <w:hyperlink w:history="1" r:id="rIdbw1xtqxscafkfpaqlu_xx">
               <w:r>
                 <w:rPr>
                   <w:rStyle w:val="Hyperlink"/>
@@ -7546,7 +7546,7 @@
             </w:tcMar>
           </w:tcPr>
           <w:p>
-            <w:hyperlink w:history="1" r:id="rIdinekl6q15rzzk6bmubk8t">
+            <w:hyperlink w:history="1" r:id="rIdq6exkp4hehhvii_tlrkn2">
               <w:r>
                 <w:rPr>
                   <w:rStyle w:val="Hyperlink"/>
@@ -7665,7 +7665,7 @@
             </w:tcMar>
           </w:tcPr>
           <w:p>
-            <w:hyperlink w:history="1" r:id="rIdwm-2abydohhqs2yqyfoc6">
+            <w:hyperlink w:history="1" r:id="rIdg49v1endwmpxejfrku39y">
               <w:r>
                 <w:rPr>
                   <w:rStyle w:val="Hyperlink"/>
@@ -7735,7 +7735,7 @@
             </w:r>
           </w:p>
           <w:p>
-            <w:hyperlink w:history="1" r:id="rIdhhhunryf9ia9tc-c43cal">
+            <w:hyperlink w:history="1" r:id="rIdfow18q1cvdckv8hkkpq2l">
               <w:r>
                 <w:rPr>
                   <w:rStyle w:val="Hyperlink"/>
@@ -7826,7 +7826,7 @@
       </w:r>
     </w:p>
     <w:p>
-      <w:hyperlink w:history="1" r:id="rIdfd_zaridwpnpg48qmtrq3">
+      <w:hyperlink w:history="1" r:id="rIdxm8amhryr2pr_pxrykeuu">
         <w:r>
           <w:rPr>
             <w:rStyle w:val="Hyperlink"/>
@@ -7847,7 +7847,7 @@
         </w:rPr>
         <w:t xml:space="preserve">Via </w:t>
       </w:r>
-      <w:hyperlink w:history="1" r:id="rIdbmlneeqpkbgw8rgumdzsc">
+      <w:hyperlink w:history="1" r:id="rIdn_qsuer6qafj_vber4lai">
         <w:r>
           <w:rPr>
             <w:color w:val="EA2E00"/>
@@ -7865,7 +7865,7 @@
         </w:rPr>
         <w:t xml:space="preserve">, </w:t>
       </w:r>
-      <w:hyperlink w:history="1" r:id="rIdl6kvxy95spvsdgltm0fc4">
+      <w:hyperlink w:history="1" r:id="rIdzrombvgd29j7duu3f0oxl">
         <w:r>
           <w:rPr>
             <w:color w:val="EA2E00"/>
@@ -7883,7 +7883,7 @@
         </w:rPr>
         <w:t xml:space="preserve">, </w:t>
       </w:r>
-      <w:hyperlink w:history="1" r:id="rId00cpjq5wfrqegmnure2w3">
+      <w:hyperlink w:history="1" r:id="rIdkhpzxhpwf7ljqc8hacaav">
         <w:r>
           <w:rPr>
             <w:color w:val="EA2E00"/>
@@ -7901,7 +7901,7 @@
         </w:rPr>
         <w:t xml:space="preserve">, </w:t>
       </w:r>
-      <w:hyperlink w:history="1" r:id="rIdn3tftceqp8izxnbolhcrq">
+      <w:hyperlink w:history="1" r:id="rIdr7gptgt0tl6p3bky_wvqe">
         <w:r>
           <w:rPr>
             <w:color w:val="EA2E00"/>
@@ -7919,7 +7919,7 @@
         </w:rPr>
         <w:t xml:space="preserve">, </w:t>
       </w:r>
-      <w:hyperlink w:history="1" r:id="rIdhqqqm1np5eni7-ezrbchb">
+      <w:hyperlink w:history="1" r:id="rIdxti-3fdcqiolw-rtb37qd">
         <w:r>
           <w:rPr>
             <w:color w:val="EA2E00"/>
@@ -7937,7 +7937,7 @@
         </w:rPr>
         <w:t xml:space="preserve">, </w:t>
       </w:r>
-      <w:hyperlink w:history="1" r:id="rIdbnhxlxvesk0gp9bfupchx">
+      <w:hyperlink w:history="1" r:id="rIdciho_ktepm6dy1pyljnbp">
         <w:r>
           <w:rPr>
             <w:color w:val="EA2E00"/>
@@ -7998,7 +7998,7 @@
       </w:r>
     </w:p>
     <w:p>
-      <w:hyperlink w:history="1" r:id="rIduvxzcmubbmujpoo8olxxv">
+      <w:hyperlink w:history="1" r:id="rIdhyp4lg6raqev9uvpnn1kh">
         <w:r>
           <w:rPr>
             <w:rStyle w:val="Hyperlink"/>
@@ -8019,7 +8019,7 @@
         </w:rPr>
         <w:t xml:space="preserve">Via </w:t>
       </w:r>
-      <w:hyperlink w:history="1" r:id="rIdzoiq9xnft7xecimcqpcz-">
+      <w:hyperlink w:history="1" r:id="rIdb0cwjmsmwwwvrhck3kdek">
         <w:r>
           <w:rPr>
             <w:color w:val="EA2E00"/>
@@ -8037,7 +8037,7 @@
         </w:rPr>
         <w:t xml:space="preserve">, </w:t>
       </w:r>
-      <w:hyperlink w:history="1" r:id="rIdsep7br0jmwjbvnryqnyf0">
+      <w:hyperlink w:history="1" r:id="rIdnm04dduq23rldvnbq36f3">
         <w:r>
           <w:rPr>
             <w:color w:val="EA2E00"/>
@@ -8055,7 +8055,7 @@
         </w:rPr>
         <w:t xml:space="preserve">, </w:t>
       </w:r>
-      <w:hyperlink w:history="1" r:id="rIdb0c1lwq_sldnubrv4fnnx">
+      <w:hyperlink w:history="1" r:id="rIdb3pj6nrtmawv5xrfcui3z">
         <w:r>
           <w:rPr>
             <w:color w:val="EA2E00"/>
@@ -8073,7 +8073,7 @@
         </w:rPr>
         <w:t xml:space="preserve">, </w:t>
       </w:r>
-      <w:hyperlink w:history="1" r:id="rIdxvuuovovemtak73qw7uxv">
+      <w:hyperlink w:history="1" r:id="rIdypo-zl9n6vyiv75amjrza">
         <w:r>
           <w:rPr>
             <w:color w:val="EA2E00"/>
@@ -8091,7 +8091,7 @@
         </w:rPr>
         <w:t xml:space="preserve">, </w:t>
       </w:r>
-      <w:hyperlink w:history="1" r:id="rId0uej8imytoqq0pf8hr3nh">
+      <w:hyperlink w:history="1" r:id="rIdmdh3knj4rbgp8c8ox3mmq">
         <w:r>
           <w:rPr>
             <w:color w:val="EA2E00"/>
@@ -8109,7 +8109,7 @@
         </w:rPr>
         <w:t xml:space="preserve">, </w:t>
       </w:r>
-      <w:hyperlink w:history="1" r:id="rIdpgwqeug03oauozxl8xvh7">
+      <w:hyperlink w:history="1" r:id="rIdgb9g1fljqdo0s46gkcyhy">
         <w:r>
           <w:rPr>
             <w:color w:val="EA2E00"/>
@@ -8127,7 +8127,7 @@
         </w:rPr>
         <w:t xml:space="preserve">, </w:t>
       </w:r>
-      <w:hyperlink w:history="1" r:id="rId1clv9vihvtzjkve5koeb6">
+      <w:hyperlink w:history="1" r:id="rId9zorhdkdhoqd8rkojtebe">
         <w:r>
           <w:rPr>
             <w:color w:val="EA2E00"/>
@@ -8145,7 +8145,7 @@
         </w:rPr>
         <w:t xml:space="preserve">, </w:t>
       </w:r>
-      <w:hyperlink w:history="1" r:id="rIdpdwwudgbq1d8fts36pdzl">
+      <w:hyperlink w:history="1" r:id="rId_axkvmh7ziuycarww3ekt">
         <w:r>
           <w:rPr>
             <w:color w:val="EA2E00"/>
@@ -8206,7 +8206,7 @@
       </w:r>
     </w:p>
     <w:p>
-      <w:hyperlink w:history="1" r:id="rIdi57zcyttsywvwr09345ty">
+      <w:hyperlink w:history="1" r:id="rIdsjmh-p8onrhoqg3lhnaad">
         <w:r>
           <w:rPr>
             <w:rStyle w:val="Hyperlink"/>
@@ -8227,7 +8227,7 @@
         </w:rPr>
         <w:t xml:space="preserve">Via </w:t>
       </w:r>
-      <w:hyperlink w:history="1" r:id="rId2bd-jehews50x24l17gbf">
+      <w:hyperlink w:history="1" r:id="rIdfdurs65lhqyp_75dokvv9">
         <w:r>
           <w:rPr>
             <w:color w:val="EA2E00"/>
@@ -8245,7 +8245,7 @@
         </w:rPr>
         <w:t xml:space="preserve">, </w:t>
       </w:r>
-      <w:hyperlink w:history="1" r:id="rIde8vajsgiqiuycwa9t_kmd">
+      <w:hyperlink w:history="1" r:id="rIdswlpalcdpiue4tifwsgm1">
         <w:r>
           <w:rPr>
             <w:color w:val="EA2E00"/>
@@ -8263,7 +8263,7 @@
         </w:rPr>
         <w:t xml:space="preserve">, </w:t>
       </w:r>
-      <w:hyperlink w:history="1" r:id="rId9v9gj3hqfqne2rs7oau4o">
+      <w:hyperlink w:history="1" r:id="rIdft86jb54php8i60fdktvk">
         <w:r>
           <w:rPr>
             <w:color w:val="EA2E00"/>
@@ -8281,7 +8281,7 @@
         </w:rPr>
         <w:t xml:space="preserve">, </w:t>
       </w:r>
-      <w:hyperlink w:history="1" r:id="rIdrjlvshtvo5ll9pk7hkoqm">
+      <w:hyperlink w:history="1" r:id="rIdnggqitw3rs-mq_unzbmas">
         <w:r>
           <w:rPr>
             <w:color w:val="EA2E00"/>
@@ -8299,7 +8299,7 @@
         </w:rPr>
         <w:t xml:space="preserve">, </w:t>
       </w:r>
-      <w:hyperlink w:history="1" r:id="rIdywwvi5_3cyo15zihjekmp">
+      <w:hyperlink w:history="1" r:id="rIdzv-m3gwdx8vpdp0ddca6z">
         <w:r>
           <w:rPr>
             <w:color w:val="EA2E00"/>
@@ -8317,7 +8317,7 @@
         </w:rPr>
         <w:t xml:space="preserve">, </w:t>
       </w:r>
-      <w:hyperlink w:history="1" r:id="rIdrjl6zpjapvx99g__lzejf">
+      <w:hyperlink w:history="1" r:id="rIdarmux7bfrwc4bsfqxr0jo">
         <w:r>
           <w:rPr>
             <w:color w:val="EA2E00"/>
@@ -8378,7 +8378,7 @@
       </w:r>
     </w:p>
     <w:p>
-      <w:hyperlink w:history="1" r:id="rIdq5hjlbmm3qx59pir2dvnq">
+      <w:hyperlink w:history="1" r:id="rId98u4ipwh614jfco5yljym">
         <w:r>
           <w:rPr>
             <w:rStyle w:val="Hyperlink"/>
@@ -8399,7 +8399,7 @@
         </w:rPr>
         <w:t xml:space="preserve">Via </w:t>
       </w:r>
-      <w:hyperlink w:history="1" r:id="rIdpughcw4-ewt0ln9m-mhxj">
+      <w:hyperlink w:history="1" r:id="rIdpghfuuf6ooa3xfzjq_nfu">
         <w:r>
           <w:rPr>
             <w:color w:val="EA2E00"/>
@@ -8417,7 +8417,7 @@
         </w:rPr>
         <w:t xml:space="preserve">, </w:t>
       </w:r>
-      <w:hyperlink w:history="1" r:id="rId7qi-kdswwhhccdb_wum6v">
+      <w:hyperlink w:history="1" r:id="rIdxovuzjdgnreqy7i8r3fwy">
         <w:r>
           <w:rPr>
             <w:color w:val="EA2E00"/>
@@ -8435,7 +8435,7 @@
         </w:rPr>
         <w:t xml:space="preserve">, </w:t>
       </w:r>
-      <w:hyperlink w:history="1" r:id="rIdamf2b4n-_s4aciyjkgq4y">
+      <w:hyperlink w:history="1" r:id="rIdslboutcipxkiixi7yhgiy">
         <w:r>
           <w:rPr>
             <w:color w:val="EA2E00"/>
@@ -8453,7 +8453,7 @@
         </w:rPr>
         <w:t xml:space="preserve">, </w:t>
       </w:r>
-      <w:hyperlink w:history="1" r:id="rIdojv6wcsw-u8ccmlbrgkuz">
+      <w:hyperlink w:history="1" r:id="rIdvofdbvgql9bobbi_jwgqg">
         <w:r>
           <w:rPr>
             <w:color w:val="EA2E00"/>
@@ -8471,7 +8471,7 @@
         </w:rPr>
         <w:t xml:space="preserve">, </w:t>
       </w:r>
-      <w:hyperlink w:history="1" r:id="rIdwi-vcwzdmj-skxhiiwqxk">
+      <w:hyperlink w:history="1" r:id="rIdy9vvcvlatuq14cv1nm9r-">
         <w:r>
           <w:rPr>
             <w:color w:val="EA2E00"/>
@@ -8489,7 +8489,7 @@
         </w:rPr>
         <w:t xml:space="preserve">, </w:t>
       </w:r>
-      <w:hyperlink w:history="1" r:id="rIdjelhy8futig7mlohhgf72">
+      <w:hyperlink w:history="1" r:id="rIdcpw9tlzzt7tkcujmpkvju">
         <w:r>
           <w:rPr>
             <w:color w:val="EA2E00"/>
@@ -8507,7 +8507,7 @@
         </w:rPr>
         <w:t xml:space="preserve">, </w:t>
       </w:r>
-      <w:hyperlink w:history="1" r:id="rIdhpk-yxiz349qur_0fc_pq">
+      <w:hyperlink w:history="1" r:id="rId46sexfifautgqmr6qtivt">
         <w:r>
           <w:rPr>
             <w:color w:val="EA2E00"/>
@@ -8568,7 +8568,7 @@
       </w:r>
     </w:p>
     <w:p>
-      <w:hyperlink w:history="1" r:id="rIdb5qonozkm6ymztsjk2enb">
+      <w:hyperlink w:history="1" r:id="rIdakmaoadtu3voexb5b7yve">
         <w:r>
           <w:rPr>
             <w:rStyle w:val="Hyperlink"/>
@@ -8589,7 +8589,7 @@
         </w:rPr>
         <w:t xml:space="preserve">Via </w:t>
       </w:r>
-      <w:hyperlink w:history="1" r:id="rIdgri9zbwg-vjp5sefdmw8z">
+      <w:hyperlink w:history="1" r:id="rId-9f6rimt07dmygyk7nkkr">
         <w:r>
           <w:rPr>
             <w:color w:val="EA2E00"/>
@@ -8607,7 +8607,7 @@
         </w:rPr>
         <w:t xml:space="preserve">, </w:t>
       </w:r>
-      <w:hyperlink w:history="1" r:id="rIdnsfqgyljgfemon_hffybe">
+      <w:hyperlink w:history="1" r:id="rIdrnslnqyq4rmgbrvblye4i">
         <w:r>
           <w:rPr>
             <w:color w:val="EA2E00"/>
@@ -8625,7 +8625,7 @@
         </w:rPr>
         <w:t xml:space="preserve">, </w:t>
       </w:r>
-      <w:hyperlink w:history="1" r:id="rIdcr3eikplujgqi0f6h7dd5">
+      <w:hyperlink w:history="1" r:id="rIdrfpss9dqnpkfmpwsrd4tq">
         <w:r>
           <w:rPr>
             <w:color w:val="EA2E00"/>
@@ -8643,7 +8643,7 @@
         </w:rPr>
         <w:t xml:space="preserve">, </w:t>
       </w:r>
-      <w:hyperlink w:history="1" r:id="rIdkl2erft_i02oo85npqbkb">
+      <w:hyperlink w:history="1" r:id="rIdr7e0gygax0c2m6ozt1z3l">
         <w:r>
           <w:rPr>
             <w:color w:val="EA2E00"/>
@@ -8661,7 +8661,7 @@
         </w:rPr>
         <w:t xml:space="preserve">, </w:t>
       </w:r>
-      <w:hyperlink w:history="1" r:id="rIdu8lyx5yoreuxiaqubxkfn">
+      <w:hyperlink w:history="1" r:id="rIdzomyqfml5sqoxqyxah_qs">
         <w:r>
           <w:rPr>
             <w:color w:val="EA2E00"/>
@@ -8722,7 +8722,7 @@
       </w:r>
     </w:p>
     <w:p>
-      <w:hyperlink w:history="1" r:id="rIdshy43bq2rt2qiippiubsp">
+      <w:hyperlink w:history="1" r:id="rId0q_ck-nhi6a1mss82-taj">
         <w:r>
           <w:rPr>
             <w:rStyle w:val="Hyperlink"/>
@@ -8743,7 +8743,7 @@
         </w:rPr>
         <w:t xml:space="preserve">Via </w:t>
       </w:r>
-      <w:hyperlink w:history="1" r:id="rIdpno0fmvmgnfuqpzeiqpe-">
+      <w:hyperlink w:history="1" r:id="rIdzdkp5ufdi2oo1ijt_kh39">
         <w:r>
           <w:rPr>
             <w:color w:val="EA2E00"/>
@@ -8761,7 +8761,7 @@
         </w:rPr>
         <w:t xml:space="preserve">, </w:t>
       </w:r>
-      <w:hyperlink w:history="1" r:id="rIdft66fixvdwm25jui2lryn">
+      <w:hyperlink w:history="1" r:id="rIdnwhad_neqt4zkbteflrwd">
         <w:r>
           <w:rPr>
             <w:color w:val="EA2E00"/>
@@ -8779,7 +8779,7 @@
         </w:rPr>
         <w:t xml:space="preserve">, </w:t>
       </w:r>
-      <w:hyperlink w:history="1" r:id="rIdbhnz1msfkrn7scdu0pykn">
+      <w:hyperlink w:history="1" r:id="rIdz7elxhzrfckud2mgntls-">
         <w:r>
           <w:rPr>
             <w:color w:val="EA2E00"/>
@@ -8797,7 +8797,7 @@
         </w:rPr>
         <w:t xml:space="preserve">, </w:t>
       </w:r>
-      <w:hyperlink w:history="1" r:id="rIdmnlcdhq844ir5fdjymrkz">
+      <w:hyperlink w:history="1" r:id="rId7kakj36p9cbxwst8k41zv">
         <w:r>
           <w:rPr>
             <w:color w:val="EA2E00"/>
@@ -8815,7 +8815,7 @@
         </w:rPr>
         <w:t xml:space="preserve">, </w:t>
       </w:r>
-      <w:hyperlink w:history="1" r:id="rIdauoy4zuiortguupqjidro">
+      <w:hyperlink w:history="1" r:id="rIdsbchcskvscjlbre1haz1-">
         <w:r>
           <w:rPr>
             <w:color w:val="EA2E00"/>
@@ -8833,7 +8833,7 @@
         </w:rPr>
         <w:t xml:space="preserve">, </w:t>
       </w:r>
-      <w:hyperlink w:history="1" r:id="rId6biiqiudoombtfmg61gqs">
+      <w:hyperlink w:history="1" r:id="rIdrj1ngjclc8jk83eiqdts-">
         <w:r>
           <w:rPr>
             <w:color w:val="EA2E00"/>
@@ -8894,7 +8894,7 @@
       </w:r>
     </w:p>
     <w:p>
-      <w:hyperlink w:history="1" r:id="rIdjpd4xrcb0xoej0p_jp3d0">
+      <w:hyperlink w:history="1" r:id="rIdmyhslszcc9obwnufhtqvg">
         <w:r>
           <w:rPr>
             <w:rStyle w:val="Hyperlink"/>
@@ -8915,7 +8915,7 @@
         </w:rPr>
         <w:t xml:space="preserve">Via </w:t>
       </w:r>
-      <w:hyperlink w:history="1" r:id="rIdgbru2cz8mgawxai0owihh">
+      <w:hyperlink w:history="1" r:id="rIdwbtm6dmfvfmzme3qoqnwt">
         <w:r>
           <w:rPr>
             <w:color w:val="EA2E00"/>
@@ -8933,7 +8933,7 @@
         </w:rPr>
         <w:t xml:space="preserve">, </w:t>
       </w:r>
-      <w:hyperlink w:history="1" r:id="rIdu2pwhw897ajopinpt39hn">
+      <w:hyperlink w:history="1" r:id="rIdkkxxvnxoyggununler63z">
         <w:r>
           <w:rPr>
             <w:color w:val="EA2E00"/>
@@ -8951,7 +8951,7 @@
         </w:rPr>
         <w:t xml:space="preserve">, </w:t>
       </w:r>
-      <w:hyperlink w:history="1" r:id="rIdwz0r6csf-zbqirztk7csj">
+      <w:hyperlink w:history="1" r:id="rIdp_i2dd3w01mdq6osvjihx">
         <w:r>
           <w:rPr>
             <w:color w:val="EA2E00"/>
@@ -8969,7 +8969,7 @@
         </w:rPr>
         <w:t xml:space="preserve">, </w:t>
       </w:r>
-      <w:hyperlink w:history="1" r:id="rId86_pki7mpme-qeow2twsq">
+      <w:hyperlink w:history="1" r:id="rIdcob6qqvkefvquuxordbph">
         <w:r>
           <w:rPr>
             <w:color w:val="EA2E00"/>
@@ -8987,7 +8987,7 @@
         </w:rPr>
         <w:t xml:space="preserve">, </w:t>
       </w:r>
-      <w:hyperlink w:history="1" r:id="rIdbws637mnbyncl0rb5ekys">
+      <w:hyperlink w:history="1" r:id="rIdyhp4zt1unayduljvr6alk">
         <w:r>
           <w:rPr>
             <w:color w:val="EA2E00"/>
@@ -9005,7 +9005,7 @@
         </w:rPr>
         <w:t xml:space="preserve">, </w:t>
       </w:r>
-      <w:hyperlink w:history="1" r:id="rIdynivuatchiizeubcpsjce">
+      <w:hyperlink w:history="1" r:id="rIdzvesvpqtepra6zyvqnqy_">
         <w:r>
           <w:rPr>
             <w:color w:val="EA2E00"/>
@@ -9066,7 +9066,7 @@
       </w:r>
     </w:p>
     <w:p>
-      <w:hyperlink w:history="1" r:id="rIdx5a3k1k-kim53riqbfuqi">
+      <w:hyperlink w:history="1" r:id="rIdbkaqv5llhkllycaw47ojp">
         <w:r>
           <w:rPr>
             <w:rStyle w:val="Hyperlink"/>
@@ -9087,7 +9087,7 @@
         </w:rPr>
         <w:t xml:space="preserve">Via </w:t>
       </w:r>
-      <w:hyperlink w:history="1" r:id="rIdu01paxjg8tiylr869m17p">
+      <w:hyperlink w:history="1" r:id="rIdylgidnq8qir51mfmlnd9t">
         <w:r>
           <w:rPr>
             <w:color w:val="EA2E00"/>
@@ -9105,7 +9105,7 @@
         </w:rPr>
         <w:t xml:space="preserve">, </w:t>
       </w:r>
-      <w:hyperlink w:history="1" r:id="rIdy3gooidfjeak-xdgmv6gj">
+      <w:hyperlink w:history="1" r:id="rIdknqgocsxzoarovue-5aql">
         <w:r>
           <w:rPr>
             <w:color w:val="EA2E00"/>
@@ -9123,7 +9123,7 @@
         </w:rPr>
         <w:t xml:space="preserve">, </w:t>
       </w:r>
-      <w:hyperlink w:history="1" r:id="rIdw_n1j3mjqd_kmeus4rhp6">
+      <w:hyperlink w:history="1" r:id="rIdliydaro3o5k8gqpefsecz">
         <w:r>
           <w:rPr>
             <w:color w:val="EA2E00"/>
@@ -9141,7 +9141,7 @@
         </w:rPr>
         <w:t xml:space="preserve">, </w:t>
       </w:r>
-      <w:hyperlink w:history="1" r:id="rId8w5pdmnnwarj-pwnmxxpw">
+      <w:hyperlink w:history="1" r:id="rIdxzk3ms5embiajnh-gwaoz">
         <w:r>
           <w:rPr>
             <w:color w:val="EA2E00"/>
@@ -9159,7 +9159,7 @@
         </w:rPr>
         <w:t xml:space="preserve">, </w:t>
       </w:r>
-      <w:hyperlink w:history="1" r:id="rIdgh5gbrge9p6ovzogdmhul">
+      <w:hyperlink w:history="1" r:id="rIdjybhd024u_2x3511jglur">
         <w:r>
           <w:rPr>
             <w:color w:val="EA2E00"/>
@@ -9220,7 +9220,7 @@
       </w:r>
     </w:p>
     <w:p>
-      <w:hyperlink w:history="1" r:id="rIdmgh_w4rqlqdfqwv-cybzy">
+      <w:hyperlink w:history="1" r:id="rId2zsnlgm84wpdmsybuj6mp">
         <w:r>
           <w:rPr>
             <w:rStyle w:val="Hyperlink"/>
@@ -9241,7 +9241,7 @@
         </w:rPr>
         <w:t xml:space="preserve">Via </w:t>
       </w:r>
-      <w:hyperlink w:history="1" r:id="rIdeaozomqae220-abu_vmaj">
+      <w:hyperlink w:history="1" r:id="rIdzv6mlrexqr784qjwu_nfu">
         <w:r>
           <w:rPr>
             <w:color w:val="EA2E00"/>
@@ -9259,7 +9259,7 @@
         </w:rPr>
         <w:t xml:space="preserve">, </w:t>
       </w:r>
-      <w:hyperlink w:history="1" r:id="rIdeuxnjapcvnblzsqldpycs">
+      <w:hyperlink w:history="1" r:id="rIdlhl3lcfpegvtlndurrnee">
         <w:r>
           <w:rPr>
             <w:color w:val="EA2E00"/>
@@ -9277,7 +9277,7 @@
         </w:rPr>
         <w:t xml:space="preserve">, </w:t>
       </w:r>
-      <w:hyperlink w:history="1" r:id="rId43of0ajz-nplhfj4c7gr_">
+      <w:hyperlink w:history="1" r:id="rIdhekf6xlkvabv8o6cgkljk">
         <w:r>
           <w:rPr>
             <w:color w:val="EA2E00"/>
@@ -9295,7 +9295,7 @@
         </w:rPr>
         <w:t xml:space="preserve">, </w:t>
       </w:r>
-      <w:hyperlink w:history="1" r:id="rIdtgqoj618yuub5uyxavrvw">
+      <w:hyperlink w:history="1" r:id="rIdgf9xdfcoo9b984kw0lwlp">
         <w:r>
           <w:rPr>
             <w:color w:val="EA2E00"/>
@@ -9313,7 +9313,7 @@
         </w:rPr>
         <w:t xml:space="preserve">, </w:t>
       </w:r>
-      <w:hyperlink w:history="1" r:id="rIdpf1dvv2wamv1jegkvkdwp">
+      <w:hyperlink w:history="1" r:id="rIdlip30fyebcchokfizrcgd">
         <w:r>
           <w:rPr>
             <w:color w:val="EA2E00"/>
@@ -9374,7 +9374,7 @@
       </w:r>
     </w:p>
     <w:p>
-      <w:hyperlink w:history="1" r:id="rIdxu4xvtjmvuodgfpou-gwm">
+      <w:hyperlink w:history="1" r:id="rIdwtuoeyetj6kpdxtwwes-t">
         <w:r>
           <w:rPr>
             <w:rStyle w:val="Hyperlink"/>
@@ -9395,7 +9395,7 @@
         </w:rPr>
         <w:t xml:space="preserve">Via </w:t>
       </w:r>
-      <w:hyperlink w:history="1" r:id="rIdu5vdyjbbjqomcc5ushfi-">
+      <w:hyperlink w:history="1" r:id="rIdp2eqco3r21v5tp3t81ddo">
         <w:r>
           <w:rPr>
             <w:color w:val="EA2E00"/>
@@ -9413,7 +9413,7 @@
         </w:rPr>
         <w:t xml:space="preserve">, </w:t>
       </w:r>
-      <w:hyperlink w:history="1" r:id="rIdh_qrteewbzb0rf8oim9r7">
+      <w:hyperlink w:history="1" r:id="rIdzynbpodywi_udnz9_obrf">
         <w:r>
           <w:rPr>
             <w:color w:val="EA2E00"/>
@@ -9431,7 +9431,7 @@
         </w:rPr>
         <w:t xml:space="preserve">, </w:t>
       </w:r>
-      <w:hyperlink w:history="1" r:id="rId55phwvz1y3wwj8ib_xmfa">
+      <w:hyperlink w:history="1" r:id="rIdptld-d5-1xcjbfnokd3oy">
         <w:r>
           <w:rPr>
             <w:color w:val="EA2E00"/>
@@ -9449,7 +9449,7 @@
         </w:rPr>
         <w:t xml:space="preserve">, </w:t>
       </w:r>
-      <w:hyperlink w:history="1" r:id="rIdcwlgpfrtodjfxmrinrrqk">
+      <w:hyperlink w:history="1" r:id="rIdn_y-dkiz6tpg_olwjkkcm">
         <w:r>
           <w:rPr>
             <w:color w:val="EA2E00"/>
@@ -9467,7 +9467,7 @@
         </w:rPr>
         <w:t xml:space="preserve">, </w:t>
       </w:r>
-      <w:hyperlink w:history="1" r:id="rIdiywnvw7wnjnaa2nlsczab">
+      <w:hyperlink w:history="1" r:id="rIdmasppw9-saj6vmxoexbsq">
         <w:r>
           <w:rPr>
             <w:color w:val="EA2E00"/>
@@ -9528,7 +9528,7 @@
       </w:r>
     </w:p>
     <w:p>
-      <w:hyperlink w:history="1" r:id="rIdcciizhythbuytdreroqrs">
+      <w:hyperlink w:history="1" r:id="rIdq9_aewz3sz8u6w-kcg_gs">
         <w:r>
           <w:rPr>
             <w:rStyle w:val="Hyperlink"/>
@@ -9549,7 +9549,7 @@
         </w:rPr>
         <w:t xml:space="preserve">Via </w:t>
       </w:r>
-      <w:hyperlink w:history="1" r:id="rId7nucry_px6ozwuaqspock">
+      <w:hyperlink w:history="1" r:id="rIdcczuz3wtgu35ynd0nxsyn">
         <w:r>
           <w:rPr>
             <w:color w:val="EA2E00"/>
@@ -9567,7 +9567,7 @@
         </w:rPr>
         <w:t xml:space="preserve">, </w:t>
       </w:r>
-      <w:hyperlink w:history="1" r:id="rIdyutk5fake2isickjymqbs">
+      <w:hyperlink w:history="1" r:id="rIdzawak-n2j55ncysfrple2">
         <w:r>
           <w:rPr>
             <w:color w:val="EA2E00"/>
@@ -9585,7 +9585,7 @@
         </w:rPr>
         <w:t xml:space="preserve">, </w:t>
       </w:r>
-      <w:hyperlink w:history="1" r:id="rIdpbmvg3gt-7fjmkfmsgcft">
+      <w:hyperlink w:history="1" r:id="rIdpwkblm1riqedfpq8t-a3v">
         <w:r>
           <w:rPr>
             <w:color w:val="EA2E00"/>
@@ -9603,7 +9603,7 @@
         </w:rPr>
         <w:t xml:space="preserve">, </w:t>
       </w:r>
-      <w:hyperlink w:history="1" r:id="rIdcyv2-npplmknya7priatv">
+      <w:hyperlink w:history="1" r:id="rIdo2hhayc2eb5i-9skbe8xu">
         <w:r>
           <w:rPr>
             <w:color w:val="EA2E00"/>
@@ -9621,7 +9621,7 @@
         </w:rPr>
         <w:t xml:space="preserve">, </w:t>
       </w:r>
-      <w:hyperlink w:history="1" r:id="rId3bhlt7xgngdmwaugdd8ex">
+      <w:hyperlink w:history="1" r:id="rIdghsqutmro6vhbdg-ap6ir">
         <w:r>
           <w:rPr>
             <w:color w:val="EA2E00"/>
@@ -9682,7 +9682,7 @@
       </w:r>
     </w:p>
     <w:p>
-      <w:hyperlink w:history="1" r:id="rIdbrso3edo0ffhm_9m-tk94">
+      <w:hyperlink w:history="1" r:id="rIdjwsdzcq5w2mxhgcm0bjk4">
         <w:r>
           <w:rPr>
             <w:rStyle w:val="Hyperlink"/>
@@ -9703,7 +9703,7 @@
         </w:rPr>
         <w:t xml:space="preserve">Via </w:t>
       </w:r>
-      <w:hyperlink w:history="1" r:id="rIdoelru8n4z3-s8ljd8_wck">
+      <w:hyperlink w:history="1" r:id="rIdcaxrb21zidlkborpxkqn2">
         <w:r>
           <w:rPr>
             <w:color w:val="EA2E00"/>
@@ -9721,7 +9721,7 @@
         </w:rPr>
         <w:t xml:space="preserve">, </w:t>
       </w:r>
-      <w:hyperlink w:history="1" r:id="rIdwlw5sg58kurihxbx3w5xb">
+      <w:hyperlink w:history="1" r:id="rId0rhhj80z9u2mutwcqykco">
         <w:r>
           <w:rPr>
             <w:color w:val="EA2E00"/>
@@ -9739,7 +9739,7 @@
         </w:rPr>
         <w:t xml:space="preserve">, </w:t>
       </w:r>
-      <w:hyperlink w:history="1" r:id="rId44gi8qgtflgnuu7-yxw0f">
+      <w:hyperlink w:history="1" r:id="rIdffufglk3hzk4kixxl0-mx">
         <w:r>
           <w:rPr>
             <w:color w:val="EA2E00"/>
@@ -9757,7 +9757,7 @@
         </w:rPr>
         <w:t xml:space="preserve">, </w:t>
       </w:r>
-      <w:hyperlink w:history="1" r:id="rIdu8camdvrii3htmudtleoa">
+      <w:hyperlink w:history="1" r:id="rIdxiioi6vnifi1jbx6gpihl">
         <w:r>
           <w:rPr>
             <w:color w:val="EA2E00"/>
@@ -9775,7 +9775,7 @@
         </w:rPr>
         <w:t xml:space="preserve">, </w:t>
       </w:r>
-      <w:hyperlink w:history="1" r:id="rIdxobcedeh6hqra0bmserow">
+      <w:hyperlink w:history="1" r:id="rIdmjqkzh5ekvlylifqssg1a">
         <w:r>
           <w:rPr>
             <w:color w:val="EA2E00"/>
@@ -9793,7 +9793,7 @@
         </w:rPr>
         <w:t xml:space="preserve">, </w:t>
       </w:r>
-      <w:hyperlink w:history="1" r:id="rIdfxdiyfjlffe5qstq_os8-">
+      <w:hyperlink w:history="1" r:id="rIdek2k0u9r0ii5_ignwrza0">
         <w:r>
           <w:rPr>
             <w:color w:val="EA2E00"/>
@@ -10354,7 +10354,7 @@
             </w:tcMar>
           </w:tcPr>
           <w:p>
-            <w:hyperlink w:history="1" r:id="rId2owdjmooqcnkdbqbbz7ey">
+            <w:hyperlink w:history="1" r:id="rIdkldjnvcc9lmnmujpcpaae">
               <w:r>
                 <w:rPr>
                   <w:b/>
@@ -10475,7 +10475,7 @@
             </w:tcMar>
           </w:tcPr>
           <w:p>
-            <w:hyperlink w:history="1" r:id="rId8n3sxiqye_2b3ja87eo1a">
+            <w:hyperlink w:history="1" r:id="rIdktvoolx5cmyygkbebhwe7">
               <w:r>
                 <w:rPr>
                   <w:b/>
@@ -10596,7 +10596,7 @@
             </w:tcMar>
           </w:tcPr>
           <w:p>
-            <w:hyperlink w:history="1" r:id="rIdtwncgx1e2r-wr9smupfhj">
+            <w:hyperlink w:history="1" r:id="rIdbbthsegqf91yumzttxvdu">
               <w:r>
                 <w:rPr>
                   <w:b/>
@@ -10717,7 +10717,7 @@
             </w:tcMar>
           </w:tcPr>
           <w:p>
-            <w:hyperlink w:history="1" r:id="rId7docsi_ssfuqess_vxvvn">
+            <w:hyperlink w:history="1" r:id="rIdipm8jzrsdzbzak-encvjd">
               <w:r>
                 <w:rPr>
                   <w:b/>
@@ -10838,7 +10838,7 @@
             </w:tcMar>
           </w:tcPr>
           <w:p>
-            <w:hyperlink w:history="1" r:id="rIdbbdeyuqllaipjfd1eq7xx">
+            <w:hyperlink w:history="1" r:id="rIdvzrexu3o-krijwedyanr1">
               <w:r>
                 <w:rPr>
                   <w:b/>
@@ -10959,7 +10959,7 @@
             </w:tcMar>
           </w:tcPr>
           <w:p>
-            <w:hyperlink w:history="1" r:id="rIdv67dsnf6_pifltkzzf-68">
+            <w:hyperlink w:history="1" r:id="rIdrxgqereguepmihnbnin8c">
               <w:r>
                 <w:rPr>
                   <w:b/>
@@ -11080,7 +11080,7 @@
             </w:tcMar>
           </w:tcPr>
           <w:p>
-            <w:hyperlink w:history="1" r:id="rIdlpej1lnzz1jkltpe7mn2c">
+            <w:hyperlink w:history="1" r:id="rIdckntpdk9uxextzb_pyzsr">
               <w:r>
                 <w:rPr>
                   <w:b/>
@@ -11201,7 +11201,7 @@
             </w:tcMar>
           </w:tcPr>
           <w:p>
-            <w:hyperlink w:history="1" r:id="rIdg9k6yjeajr3oxaegr30t6">
+            <w:hyperlink w:history="1" r:id="rId0qotejlcjia6thjtmd4w-">
               <w:r>
                 <w:rPr>
                   <w:b/>
@@ -11322,7 +11322,7 @@
             </w:tcMar>
           </w:tcPr>
           <w:p>
-            <w:hyperlink w:history="1" r:id="rIdafunagvo1yava-h_ackyd">
+            <w:hyperlink w:history="1" r:id="rIdwobpkithcjk3fq0bkglan">
               <w:r>
                 <w:rPr>
                   <w:b/>
@@ -11443,7 +11443,7 @@
             </w:tcMar>
           </w:tcPr>
           <w:p>
-            <w:hyperlink w:history="1" r:id="rIdc-8co7qe_srk1zihsyflx">
+            <w:hyperlink w:history="1" r:id="rIdsa4mciyr67ofmbxvmexri">
               <w:r>
                 <w:rPr>
                   <w:b/>
@@ -11564,7 +11564,7 @@
             </w:tcMar>
           </w:tcPr>
           <w:p>
-            <w:hyperlink w:history="1" r:id="rIddbqgyiyetc5caj3192-of">
+            <w:hyperlink w:history="1" r:id="rIdagbuscn3nzkjfdlxrjesx">
               <w:r>
                 <w:rPr>
                   <w:b/>
@@ -11685,7 +11685,7 @@
             </w:tcMar>
           </w:tcPr>
           <w:p>
-            <w:hyperlink w:history="1" r:id="rIdlpyvxyxp2tvxice17tk61">
+            <w:hyperlink w:history="1" r:id="rIdw0aivv_a2dyhi80zcuw0s">
               <w:r>
                 <w:rPr>
                   <w:b/>
@@ -11868,7 +11868,7 @@
         </w:rPr>
         <w:t xml:space="preserve">Via </w:t>
       </w:r>
-      <w:hyperlink w:history="1" r:id="rIdpau-ceq6ewbphnssj5i0k">
+      <w:hyperlink w:history="1" r:id="rId3shbhwtpcdil8jg6gpgjr">
         <w:r>
           <w:rPr>
             <w:color w:val="EA2E00"/>
@@ -11886,7 +11886,7 @@
         </w:rPr>
         <w:t xml:space="preserve">, </w:t>
       </w:r>
-      <w:hyperlink w:history="1" r:id="rIdawymz4cgyzyhfhwzmy39j">
+      <w:hyperlink w:history="1" r:id="rIdcptjjyk-4w9ir0hamulta">
         <w:r>
           <w:rPr>
             <w:color w:val="EA2E00"/>
@@ -11904,7 +11904,7 @@
         </w:rPr>
         <w:t xml:space="preserve">, </w:t>
       </w:r>
-      <w:hyperlink w:history="1" r:id="rIdewgjmabqflr7dsxcic6zk">
+      <w:hyperlink w:history="1" r:id="rIdfkksak4pgx_nymomtbcgb">
         <w:r>
           <w:rPr>
             <w:color w:val="EA2E00"/>
@@ -11947,7 +11947,7 @@
         </w:rPr>
         <w:t xml:space="preserve">Via </w:t>
       </w:r>
-      <w:hyperlink w:history="1" r:id="rIdxmlitafqf9yozqr-z9_ep">
+      <w:hyperlink w:history="1" r:id="rIdkw5tx-lbvd9ll3oktt-v2">
         <w:r>
           <w:rPr>
             <w:color w:val="EA2E00"/>
@@ -11965,7 +11965,7 @@
         </w:rPr>
         <w:t xml:space="preserve">, </w:t>
       </w:r>
-      <w:hyperlink w:history="1" r:id="rIdelw2cr_jdx4hehwdxyrln">
+      <w:hyperlink w:history="1" r:id="rIdz4r28uhuhajeq3qbcd66n">
         <w:r>
           <w:rPr>
             <w:color w:val="EA2E00"/>
@@ -11983,7 +11983,7 @@
         </w:rPr>
         <w:t xml:space="preserve">, </w:t>
       </w:r>
-      <w:hyperlink w:history="1" r:id="rId6inv9je0bw61z4zp_4ds4">
+      <w:hyperlink w:history="1" r:id="rIdqzrg6so4raxss21zrcr8_">
         <w:r>
           <w:rPr>
             <w:color w:val="EA2E00"/>
@@ -12001,7 +12001,7 @@
         </w:rPr>
         <w:t xml:space="preserve">, </w:t>
       </w:r>
-      <w:hyperlink w:history="1" r:id="rIdgmd_pvbk4jdyihpjiimgd">
+      <w:hyperlink w:history="1" r:id="rId0cb5-c9lhjpkgqzcygdil">
         <w:r>
           <w:rPr>
             <w:color w:val="EA2E00"/>
@@ -12019,7 +12019,7 @@
         </w:rPr>
         <w:t xml:space="preserve">, </w:t>
       </w:r>
-      <w:hyperlink w:history="1" r:id="rIdwvc_8rnuvdjkh8xmlh2bt">
+      <w:hyperlink w:history="1" r:id="rIdqpy0cq3g-aruai0-9lz_d">
         <w:r>
           <w:rPr>
             <w:color w:val="EA2E00"/>
@@ -12062,7 +12062,7 @@
         </w:rPr>
         <w:t xml:space="preserve">Via </w:t>
       </w:r>
-      <w:hyperlink w:history="1" r:id="rId2qo_-ynxtbqwphnc7nlf5">
+      <w:hyperlink w:history="1" r:id="rIdoox9phhhfahywyvb9c1nl">
         <w:r>
           <w:rPr>
             <w:color w:val="EA2E00"/>
@@ -12080,7 +12080,7 @@
         </w:rPr>
         <w:t xml:space="preserve">, </w:t>
       </w:r>
-      <w:hyperlink w:history="1" r:id="rId8lspive0vnqp8sy8dmtwm">
+      <w:hyperlink w:history="1" r:id="rIdfaaylkjvmvd_8q2ntdk7-">
         <w:r>
           <w:rPr>
             <w:color w:val="EA2E00"/>
@@ -12098,7 +12098,7 @@
         </w:rPr>
         <w:t xml:space="preserve">, </w:t>
       </w:r>
-      <w:hyperlink w:history="1" r:id="rIdwyqy38yu9-hclhnpgsdwr">
+      <w:hyperlink w:history="1" r:id="rIdhi2njjv2owg2csdyofnmu">
         <w:r>
           <w:rPr>
             <w:color w:val="EA2E00"/>
@@ -12116,7 +12116,7 @@
         </w:rPr>
         <w:t xml:space="preserve">, </w:t>
       </w:r>
-      <w:hyperlink w:history="1" r:id="rIdnmy0zdh9deaatq5-m1bdf">
+      <w:hyperlink w:history="1" r:id="rId_m7wh-dw91f5ocjgxha14">
         <w:r>
           <w:rPr>
             <w:color w:val="EA2E00"/>
@@ -12159,7 +12159,7 @@
         </w:rPr>
         <w:t xml:space="preserve">Via </w:t>
       </w:r>
-      <w:hyperlink w:history="1" r:id="rIdpifkl4jf9nn74ils6dbqe">
+      <w:hyperlink w:history="1" r:id="rId58evmq4rqamm7xfradvyb">
         <w:r>
           <w:rPr>
             <w:color w:val="EA2E00"/>
@@ -12177,7 +12177,7 @@
         </w:rPr>
         <w:t xml:space="preserve">, </w:t>
       </w:r>
-      <w:hyperlink w:history="1" r:id="rId2ak-isbtubygak2vrec-t">
+      <w:hyperlink w:history="1" r:id="rIdq4v3yyrkmnxy-t_wdfcah">
         <w:r>
           <w:rPr>
             <w:color w:val="EA2E00"/>
@@ -12195,7 +12195,7 @@
         </w:rPr>
         <w:t xml:space="preserve">, </w:t>
       </w:r>
-      <w:hyperlink w:history="1" r:id="rIdr_unto49cxhqljmgmzvbb">
+      <w:hyperlink w:history="1" r:id="rIdjnaejqtgxmqbszkvhlkut">
         <w:r>
           <w:rPr>
             <w:color w:val="EA2E00"/>
@@ -12238,7 +12238,7 @@
         </w:rPr>
         <w:t xml:space="preserve">Via </w:t>
       </w:r>
-      <w:hyperlink w:history="1" r:id="rIdvkke6_0yc2nprhzln_5dq">
+      <w:hyperlink w:history="1" r:id="rId-r6ztgwuab1dmugx12tfu">
         <w:r>
           <w:rPr>
             <w:color w:val="EA2E00"/>
@@ -12256,7 +12256,7 @@
         </w:rPr>
         <w:t xml:space="preserve">, </w:t>
       </w:r>
-      <w:hyperlink w:history="1" r:id="rIdndvtzgw4zuazjjof8k2hw">
+      <w:hyperlink w:history="1" r:id="rIdckhy9ykoaxpak81pnzyxy">
         <w:r>
           <w:rPr>
             <w:color w:val="EA2E00"/>
@@ -12274,7 +12274,7 @@
         </w:rPr>
         <w:t xml:space="preserve">, </w:t>
       </w:r>
-      <w:hyperlink w:history="1" r:id="rIdnqyfyi204foeyiva42io3">
+      <w:hyperlink w:history="1" r:id="rId09g4pytid-q3ywfrcw85u">
         <w:r>
           <w:rPr>
             <w:color w:val="EA2E00"/>
@@ -14205,7 +14205,7 @@
             </w:r>
           </w:p>
           <w:p>
-            <w:hyperlink w:history="1" r:id="rIdwcjcah2dkuvqtwizxcw5j">
+            <w:hyperlink w:history="1" r:id="rIdewzhmpdft9zxnmm0ohiri">
               <w:r>
                 <w:rPr>
                   <w:rStyle w:val="Hyperlink"/>
@@ -14292,7 +14292,7 @@
         <w:spacing w:after="80"/>
         <w:ind w:left="620"/>
       </w:pPr>
-      <w:hyperlink w:history="1" r:id="rIdxfyb43dm387mhhix-1e0n">
+      <w:hyperlink w:history="1" r:id="rId-jvdc8mmpkq9mlmwxxwts">
         <w:r>
           <w:rPr>
             <w:sz w:val="16"/>
@@ -14328,7 +14328,7 @@
         <w:spacing w:after="80"/>
         <w:ind w:left="620"/>
       </w:pPr>
-      <w:hyperlink w:history="1" r:id="rIdg1cizo4bmuuqq0j-mazuz">
+      <w:hyperlink w:history="1" r:id="rIdr24vybfstz8xvkhtzja6k">
         <w:r>
           <w:rPr>
             <w:sz w:val="16"/>
@@ -14364,7 +14364,7 @@
         <w:spacing w:after="80"/>
         <w:ind w:left="620"/>
       </w:pPr>
-      <w:hyperlink w:history="1" r:id="rIdpxa5jbb87hca9_2thxici">
+      <w:hyperlink w:history="1" r:id="rIdlkraavghgowuqhsyw_z9n">
         <w:r>
           <w:rPr>
             <w:sz w:val="16"/>
@@ -14392,7 +14392,7 @@
         <w:t xml:space="preserve">Do I need to stamp my ticket?</w:t>
       </w:r>
       <w:r>
-        <w:t xml:space="preserve"> Paper tickets must be stamped before the first ride. Fare evasion costs EUR 60 (BVG). A EUR 7 fee applies if you can prove you held a valid personal ticket. Even forgotten stamps count. Whether app tickets need validating was NOT VERIFIED on the pages read.</w:t>
+        <w:t xml:space="preserve"> Paper tickets must be stamped before the first ride. Fare evasion costs EUR 60 (BVG). A EUR 7 fee applies if you can prove you held a valid personal ticket. Even forgotten stamps count. Whether app tickets need validating was not yet confirmed on the pages read.</w:t>
       </w:r>
     </w:p>
     <w:p>
@@ -14400,7 +14400,7 @@
         <w:spacing w:after="80"/>
         <w:ind w:left="620"/>
       </w:pPr>
-      <w:hyperlink w:history="1" r:id="rIdl-90msv_vxt6uclkpejwr">
+      <w:hyperlink w:history="1" r:id="rIdue2w0wtcpblsh9t0owixe">
         <w:r>
           <w:rPr>
             <w:sz w:val="16"/>
@@ -14436,7 +14436,7 @@
         <w:spacing w:after="80"/>
         <w:ind w:left="620"/>
       </w:pPr>
-      <w:hyperlink w:history="1" r:id="rIdp7y5a749awglb3jf_keoc">
+      <w:hyperlink w:history="1" r:id="rIdqj_dgm84eioxezqgxbdb9">
         <w:r>
           <w:rPr>
             <w:sz w:val="16"/>
@@ -14472,7 +14472,7 @@
         <w:spacing w:after="80"/>
         <w:ind w:left="620"/>
       </w:pPr>
-      <w:hyperlink w:history="1" r:id="rId96l-hhve_algeuaxyly1x">
+      <w:hyperlink w:history="1" r:id="rIdjrbqpcivtt3vrsealk6lf">
         <w:r>
           <w:rPr>
             <w:sz w:val="16"/>
@@ -14508,7 +14508,7 @@
         <w:spacing w:after="80"/>
         <w:ind w:left="620"/>
       </w:pPr>
-      <w:hyperlink w:history="1" r:id="rIdoq6_czxjdugny0x7g_9qf">
+      <w:hyperlink w:history="1" r:id="rIdqwgt2bfneyksupjeck5k4">
         <w:r>
           <w:rPr>
             <w:sz w:val="16"/>
@@ -14544,7 +14544,7 @@
         <w:spacing w:after="80"/>
         <w:ind w:left="620"/>
       </w:pPr>
-      <w:hyperlink w:history="1" r:id="rIdupwllpnglgyiatkjjqxk8">
+      <w:hyperlink w:history="1" r:id="rIdfr5rsmfod8ousmhfkug-e">
         <w:r>
           <w:rPr>
             <w:sz w:val="16"/>
@@ -14588,7 +14588,7 @@
         <w:spacing w:after="80"/>
         <w:ind w:left="620"/>
       </w:pPr>
-      <w:hyperlink w:history="1" r:id="rIdsfqpfv1xmhgdxzca4efaa">
+      <w:hyperlink w:history="1" r:id="rId91t00i-q4vimj82oq2kge">
         <w:r>
           <w:rPr>
             <w:sz w:val="16"/>
@@ -14624,7 +14624,7 @@
         <w:spacing w:after="80"/>
         <w:ind w:left="620"/>
       </w:pPr>
-      <w:hyperlink w:history="1" r:id="rId4jtau1nw0hf-iqm3xkrbu">
+      <w:hyperlink w:history="1" r:id="rIdkjkpqg8-suxfuoxdyktin">
         <w:r>
           <w:rPr>
             <w:sz w:val="16"/>
@@ -14660,7 +14660,7 @@
         <w:spacing w:after="80"/>
         <w:ind w:left="620"/>
       </w:pPr>
-      <w:hyperlink w:history="1" r:id="rIdpinxba594w_xsmgdfrraz">
+      <w:hyperlink w:history="1" r:id="rId_w9q3pxqnp20mzlmisg2l">
         <w:r>
           <w:rPr>
             <w:sz w:val="16"/>
@@ -14704,7 +14704,7 @@
         <w:spacing w:after="80"/>
         <w:ind w:left="620"/>
       </w:pPr>
-      <w:hyperlink w:history="1" r:id="rIdzi69vdscmfrviqfomsjze">
+      <w:hyperlink w:history="1" r:id="rId7qsdhxhjnbw0br8dcf6sa">
         <w:r>
           <w:rPr>
             <w:sz w:val="16"/>
@@ -14748,7 +14748,7 @@
         <w:spacing w:after="80"/>
         <w:ind w:left="620"/>
       </w:pPr>
-      <w:hyperlink w:history="1" r:id="rIdka66wc18k35xlt3hul0mc">
+      <w:hyperlink w:history="1" r:id="rIdsixr2nau3o9g6wazd8mpe">
         <w:r>
           <w:rPr>
             <w:sz w:val="16"/>
@@ -14792,7 +14792,7 @@
         <w:spacing w:after="80"/>
         <w:ind w:left="620"/>
       </w:pPr>
-      <w:hyperlink w:history="1" r:id="rIddap8_mrfyppxfseeqvopy">
+      <w:hyperlink w:history="1" r:id="rIdwpsupswqd55nnf4qgkec3">
         <w:r>
           <w:rPr>
             <w:sz w:val="16"/>
@@ -14828,7 +14828,7 @@
         <w:spacing w:after="80"/>
         <w:ind w:left="620"/>
       </w:pPr>
-      <w:hyperlink w:history="1" r:id="rIdczp0t81wpvmy8r8r1qyp2">
+      <w:hyperlink w:history="1" r:id="rIdx7amk-pb2rhjpd0drsslh">
         <w:r>
           <w:rPr>
             <w:sz w:val="16"/>
@@ -14864,7 +14864,7 @@
         <w:t xml:space="preserve">What about roaming?</w:t>
       </w:r>
       <w:r>
-        <w:t xml:space="preserve"> Check with your provider before you go. Which? (undated) listed O2 free with a 25GB fair-use limit, EE GBP 2.59 a day, Vodafone GBP 2.57, Three GBP 2. Whether those prices are still current is NOT VERIFIED.</w:t>
+        <w:t xml:space="preserve"> Check with your provider before you go. Which? (undated) listed O2 free with a 25GB fair-use limit, EE GBP 2.59 a day, Vodafone GBP 2.57, Three GBP 2. Whether those prices are still current is not yet confirmed.</w:t>
       </w:r>
     </w:p>
     <w:p>
@@ -14872,7 +14872,7 @@
         <w:spacing w:after="80"/>
         <w:ind w:left="620"/>
       </w:pPr>
-      <w:hyperlink w:history="1" r:id="rId9xxloif_btclpofjx-xbe">
+      <w:hyperlink w:history="1" r:id="rId-mplrpa4opfgxnhjbpo5g">
         <w:r>
           <w:rPr>
             <w:sz w:val="16"/>
@@ -14916,7 +14916,7 @@
         <w:spacing w:after="80"/>
         <w:ind w:left="620"/>
       </w:pPr>
-      <w:hyperlink w:history="1" r:id="rIdueobr85pcwjfq1734qbed">
+      <w:hyperlink w:history="1" r:id="rIdkbfjxwrjv3adetj5ssxpf">
         <w:r>
           <w:rPr>
             <w:sz w:val="16"/>
@@ -14952,7 +14952,7 @@
         <w:spacing w:after="80"/>
         <w:ind w:left="620"/>
       </w:pPr>
-      <w:hyperlink w:history="1" r:id="rIdhx4tptwcfrj2-omqmayzn">
+      <w:hyperlink w:history="1" r:id="rIdlsgeh9pet_jwwq20z9a19">
         <w:r>
           <w:rPr>
             <w:sz w:val="16"/>
@@ -14988,7 +14988,7 @@
         <w:spacing w:after="80"/>
         <w:ind w:left="620"/>
       </w:pPr>
-      <w:hyperlink w:history="1" r:id="rIdwnzetxurf54i-y95kly4h">
+      <w:hyperlink w:history="1" r:id="rIddxbpfdktl374pi2antt_d">
         <w:r>
           <w:rPr>
             <w:sz w:val="16"/>
@@ -15024,7 +15024,7 @@
         <w:spacing w:after="80"/>
         <w:ind w:left="620"/>
       </w:pPr>
-      <w:hyperlink w:history="1" r:id="rIdgyruhpy4eravzptrqzo3u">
+      <w:hyperlink w:history="1" r:id="rId-xsuc1-gs8rov_xgtxenz">
         <w:r>
           <w:rPr>
             <w:sz w:val="16"/>
@@ -15060,7 +15060,7 @@
         <w:spacing w:after="80"/>
         <w:ind w:left="620"/>
       </w:pPr>
-      <w:hyperlink w:history="1" r:id="rIdyc0ctruukg-aorx0jxkxb">
+      <w:hyperlink w:history="1" r:id="rIddbafanxdtopup5nvttji6">
         <w:r>
           <w:rPr>
             <w:sz w:val="16"/>
@@ -15096,7 +15096,7 @@
         <w:spacing w:after="80"/>
         <w:ind w:left="620"/>
       </w:pPr>
-      <w:hyperlink w:history="1" r:id="rIdagmjzwbgspeln3ptl0vxa">
+      <w:hyperlink w:history="1" r:id="rIdsninkytjd8ojq7hppdmu4">
         <w:r>
           <w:rPr>
             <w:sz w:val="16"/>
@@ -15132,7 +15132,7 @@
         <w:spacing w:after="80"/>
         <w:ind w:left="620"/>
       </w:pPr>
-      <w:hyperlink w:history="1" r:id="rIdnkkcp-mqwrriuz07g4ls5">
+      <w:hyperlink w:history="1" r:id="rIdkg9lkli2gz6eeijkcqxik">
         <w:r>
           <w:rPr>
             <w:sz w:val="16"/>
@@ -15168,7 +15168,7 @@
         <w:spacing w:after="80"/>
         <w:ind w:left="620"/>
       </w:pPr>
-      <w:hyperlink w:history="1" r:id="rId2-frgcfimufllc_etglbt">
+      <w:hyperlink w:history="1" r:id="rIdlgcg4ptbgptov2i96jj5z">
         <w:r>
           <w:rPr>
             <w:sz w:val="16"/>
@@ -15204,7 +15204,7 @@
         <w:spacing w:after="80"/>
         <w:ind w:left="620"/>
       </w:pPr>
-      <w:hyperlink w:history="1" r:id="rIdjcxz9ltano8h2pcsby4pw">
+      <w:hyperlink w:history="1" r:id="rIdjml3o16u9d2y5twaopz8g">
         <w:r>
           <w:rPr>
             <w:sz w:val="16"/>
@@ -15240,7 +15240,7 @@
         <w:spacing w:after="80"/>
         <w:ind w:left="620"/>
       </w:pPr>
-      <w:hyperlink w:history="1" r:id="rIdo9woi6uwe-wxnzbqrzjvt">
+      <w:hyperlink w:history="1" r:id="rIdfahyduw8n6otoxzeukzey">
         <w:r>
           <w:rPr>
             <w:sz w:val="16"/>
@@ -15284,7 +15284,7 @@
         <w:spacing w:after="80"/>
         <w:ind w:left="620"/>
       </w:pPr>
-      <w:hyperlink w:history="1" r:id="rIdlrgch4vdqclabhxxrordp">
+      <w:hyperlink w:history="1" r:id="rId-y42odjinzvrgv-spwldo">
         <w:r>
           <w:rPr>
             <w:sz w:val="16"/>
@@ -15320,7 +15320,7 @@
         <w:spacing w:after="80"/>
         <w:ind w:left="620"/>
       </w:pPr>
-      <w:hyperlink w:history="1" r:id="rIdeehshssjdyifz-kryqsvs">
+      <w:hyperlink w:history="1" r:id="rIdmzsmsnopzdgo7spojg44l">
         <w:r>
           <w:rPr>
             <w:sz w:val="16"/>
@@ -15356,7 +15356,7 @@
         <w:spacing w:after="80"/>
         <w:ind w:left="620"/>
       </w:pPr>
-      <w:hyperlink w:history="1" r:id="rIdoylj54b_oemsz13obd9bs">
+      <w:hyperlink w:history="1" r:id="rId-6hwk7uhtzoc5tmuyvynq">
         <w:r>
           <w:rPr>
             <w:sz w:val="16"/>
@@ -15392,7 +15392,7 @@
         <w:spacing w:after="80"/>
         <w:ind w:left="620"/>
       </w:pPr>
-      <w:hyperlink w:history="1" r:id="rIde-l0vhfxgrapnjp7mlodl">
+      <w:hyperlink w:history="1" r:id="rIdfsafmmqiygarmoucpm_e4">
         <w:r>
           <w:rPr>
             <w:sz w:val="16"/>
@@ -15428,7 +15428,7 @@
         <w:spacing w:after="80"/>
         <w:ind w:left="620"/>
       </w:pPr>
-      <w:hyperlink w:history="1" r:id="rIdof8qbj68tt7cop2o0ihi9">
+      <w:hyperlink w:history="1" r:id="rIdc94t8d4obpdz2e1wqdmo-">
         <w:r>
           <w:rPr>
             <w:sz w:val="16"/>
@@ -15464,7 +15464,7 @@
         <w:spacing w:after="80"/>
         <w:ind w:left="620"/>
       </w:pPr>
-      <w:hyperlink w:history="1" r:id="rId1wzunbfu3wxdspuzlkqyd">
+      <w:hyperlink w:history="1" r:id="rIdimq6hm-bb6qlmxf8h38cl">
         <w:r>
           <w:rPr>
             <w:sz w:val="16"/>
@@ -15492,7 +15492,7 @@
         <w:t xml:space="preserve">Can I do Potsdam in a day?</w:t>
       </w:r>
       <w:r>
-        <w:t xml:space="preserve"> Yes. Berlin ABC tickets cover Potsdam Hbf, so no extra ticket is needed. A Brandenburg-Berlin-Ticket costs EUR 36.50 for up to 5 people (DB Regio). Palace opening hours in Dec were NOT VERIFIED.</w:t>
+        <w:t xml:space="preserve"> Yes. Berlin ABC tickets cover Potsdam Hbf, so no extra ticket is needed. A Brandenburg-Berlin-Ticket costs EUR 36.50 for up to 5 people (DB Regio). Palace opening hours in Dec were not yet confirmed.</w:t>
       </w:r>
     </w:p>
     <w:p>
@@ -15500,7 +15500,7 @@
         <w:spacing w:after="80"/>
         <w:ind w:left="620"/>
       </w:pPr>
-      <w:hyperlink w:history="1" r:id="rIdzzxevnacv2m1hj6ie4qzz">
+      <w:hyperlink w:history="1" r:id="rIdhd-dfnjfwj0z0rujpgnmk">
         <w:r>
           <w:rPr>
             <w:sz w:val="16"/>
@@ -15562,7 +15562,7 @@
         </w:numPr>
         <w:spacing w:after="60"/>
       </w:pPr>
-      <w:hyperlink w:history="1" r:id="rIdiozqu-p49535jo7mea_ww">
+      <w:hyperlink w:history="1" r:id="rIdmydci-nmeat-6agipwhph">
         <w:r>
           <w:rPr>
             <w:sz w:val="18"/>
@@ -15590,7 +15590,7 @@
         </w:numPr>
         <w:spacing w:after="60"/>
       </w:pPr>
-      <w:hyperlink w:history="1" r:id="rIdogycmp6p2jnu-lxkhnpne">
+      <w:hyperlink w:history="1" r:id="rIdj0h87xntz3sxbxj7z1gfi">
         <w:r>
           <w:rPr>
             <w:sz w:val="18"/>
@@ -15618,7 +15618,7 @@
         </w:numPr>
         <w:spacing w:after="60"/>
       </w:pPr>
-      <w:hyperlink w:history="1" r:id="rId43s-hvbv8rqt3bxnh48bd">
+      <w:hyperlink w:history="1" r:id="rIdtkphee9q-5fser6lpjduj">
         <w:r>
           <w:rPr>
             <w:sz w:val="18"/>
@@ -15646,7 +15646,7 @@
         </w:numPr>
         <w:spacing w:after="60"/>
       </w:pPr>
-      <w:hyperlink w:history="1" r:id="rIdlm7_gwfgxyuqgctzoa4bw">
+      <w:hyperlink w:history="1" r:id="rIdfzzxq3bo6rhun09zigjuo">
         <w:r>
           <w:rPr>
             <w:sz w:val="18"/>
@@ -15674,7 +15674,7 @@
         </w:numPr>
         <w:spacing w:after="60"/>
       </w:pPr>
-      <w:hyperlink w:history="1" r:id="rIdfed7nfjgqxdkuwh6u36a6">
+      <w:hyperlink w:history="1" r:id="rId4zyejkv19ixjwjm7mkrvm">
         <w:r>
           <w:rPr>
             <w:sz w:val="18"/>
@@ -15702,7 +15702,7 @@
         </w:numPr>
         <w:spacing w:after="60"/>
       </w:pPr>
-      <w:hyperlink w:history="1" r:id="rIdmyk_d5tkgofqzfbsenscd">
+      <w:hyperlink w:history="1" r:id="rIdr4r5ionmgc0hky0x6shqy">
         <w:r>
           <w:rPr>
             <w:sz w:val="18"/>
@@ -15730,7 +15730,7 @@
         </w:numPr>
         <w:spacing w:after="60"/>
       </w:pPr>
-      <w:hyperlink w:history="1" r:id="rIdjewmqgzd0kdxrdeeixbrl">
+      <w:hyperlink w:history="1" r:id="rId4xubtv3ld_wfy6zxcbmqg">
         <w:r>
           <w:rPr>
             <w:sz w:val="18"/>
@@ -15758,7 +15758,7 @@
         </w:numPr>
         <w:spacing w:after="60"/>
       </w:pPr>
-      <w:hyperlink w:history="1" r:id="rId_cqh4ies7wnlmwzwx6rdd">
+      <w:hyperlink w:history="1" r:id="rIdcxrqshhjakaayg5myr0eo">
         <w:r>
           <w:rPr>
             <w:sz w:val="18"/>
@@ -15786,7 +15786,7 @@
         </w:numPr>
         <w:spacing w:after="60"/>
       </w:pPr>
-      <w:hyperlink w:history="1" r:id="rIdzoxanb4ggf-7n1dpvif7w">
+      <w:hyperlink w:history="1" r:id="rIdbttjpmjkccvrosng70s_n">
         <w:r>
           <w:rPr>
             <w:sz w:val="18"/>
@@ -15814,7 +15814,7 @@
         </w:numPr>
         <w:spacing w:after="60"/>
       </w:pPr>
-      <w:hyperlink w:history="1" r:id="rIduzygcz46n9_tff_8dka9p">
+      <w:hyperlink w:history="1" r:id="rIdkmbeo0kbbyjgtsxc2ijjp">
         <w:r>
           <w:rPr>
             <w:sz w:val="18"/>
@@ -15842,7 +15842,7 @@
         </w:numPr>
         <w:spacing w:after="60"/>
       </w:pPr>
-      <w:hyperlink w:history="1" r:id="rIdql-0mj1xku7cfhubxjyk2">
+      <w:hyperlink w:history="1" r:id="rIdf8gh4ujfpp0dqohw-7asf">
         <w:r>
           <w:rPr>
             <w:sz w:val="18"/>
@@ -15870,7 +15870,7 @@
         </w:numPr>
         <w:spacing w:after="60"/>
       </w:pPr>
-      <w:hyperlink w:history="1" r:id="rIdpklfqepw7g5zsdqi4gxlw">
+      <w:hyperlink w:history="1" r:id="rId_j8kj7fjnpwwt26y17cmb">
         <w:r>
           <w:rPr>
             <w:sz w:val="18"/>
@@ -15898,7 +15898,7 @@
         </w:numPr>
         <w:spacing w:after="60"/>
       </w:pPr>
-      <w:hyperlink w:history="1" r:id="rIdxbuyznuitotfvm4e9h4mc">
+      <w:hyperlink w:history="1" r:id="rIdoxwna-me54fazhjinukcs">
         <w:r>
           <w:rPr>
             <w:sz w:val="18"/>
@@ -15926,7 +15926,7 @@
         </w:numPr>
         <w:spacing w:after="60"/>
       </w:pPr>
-      <w:hyperlink w:history="1" r:id="rIdcurzbbxl6mqfe2chxiow7">
+      <w:hyperlink w:history="1" r:id="rId8cmafuhnlwslpeceml-r8">
         <w:r>
           <w:rPr>
             <w:sz w:val="18"/>
@@ -15954,7 +15954,7 @@
         </w:numPr>
         <w:spacing w:after="60"/>
       </w:pPr>
-      <w:hyperlink w:history="1" r:id="rId3vayi62omdlinhif2hirv">
+      <w:hyperlink w:history="1" r:id="rIdgyaihm-bqeo-wzmzavx0b">
         <w:r>
           <w:rPr>
             <w:sz w:val="18"/>
@@ -15982,7 +15982,7 @@
         </w:numPr>
         <w:spacing w:after="60"/>
       </w:pPr>
-      <w:hyperlink w:history="1" r:id="rId3rmqoxshvlkzu9cj9uhw4">
+      <w:hyperlink w:history="1" r:id="rIdrohpce2wblmcqohiqsvvd">
         <w:r>
           <w:rPr>
             <w:sz w:val="18"/>
@@ -16010,7 +16010,7 @@
         </w:numPr>
         <w:spacing w:after="60"/>
       </w:pPr>
-      <w:hyperlink w:history="1" r:id="rIdotsb5-yrcx_2zhyqwtm8m">
+      <w:hyperlink w:history="1" r:id="rIdphm8xmzujvmjlpclv2fox">
         <w:r>
           <w:rPr>
             <w:sz w:val="18"/>
@@ -16038,7 +16038,7 @@
         </w:numPr>
         <w:spacing w:after="60"/>
       </w:pPr>
-      <w:hyperlink w:history="1" r:id="rId1iqvzjof6ord2cxyrbto1">
+      <w:hyperlink w:history="1" r:id="rIduhfqu56zg8g34rquvymrn">
         <w:r>
           <w:rPr>
             <w:sz w:val="18"/>
@@ -16066,7 +16066,7 @@
         </w:numPr>
         <w:spacing w:after="60"/>
       </w:pPr>
-      <w:hyperlink w:history="1" r:id="rIdefvuicg_waoots9kml5sp">
+      <w:hyperlink w:history="1" r:id="rIdtplxi-4qsqep7bien9ra2">
         <w:r>
           <w:rPr>
             <w:sz w:val="18"/>
@@ -16094,7 +16094,7 @@
         </w:numPr>
         <w:spacing w:after="60"/>
       </w:pPr>
-      <w:hyperlink w:history="1" r:id="rIds9jukvwouupeeuvl0gjcb">
+      <w:hyperlink w:history="1" r:id="rIdl2ptix5afbcs7jxvecwpw">
         <w:r>
           <w:rPr>
             <w:sz w:val="18"/>
@@ -16122,7 +16122,7 @@
         </w:numPr>
         <w:spacing w:after="60"/>
       </w:pPr>
-      <w:hyperlink w:history="1" r:id="rIdlo6enphvfxozm9p9xo4rt">
+      <w:hyperlink w:history="1" r:id="rIde487xrew0nzl71ov4x1-2">
         <w:r>
           <w:rPr>
             <w:sz w:val="18"/>
@@ -16150,7 +16150,7 @@
         </w:numPr>
         <w:spacing w:after="60"/>
       </w:pPr>
-      <w:hyperlink w:history="1" r:id="rIdmb500yqocmn2c1u6eskkh">
+      <w:hyperlink w:history="1" r:id="rIdlygqscehlw7wkoro6tcpt">
         <w:r>
           <w:rPr>
             <w:sz w:val="18"/>
@@ -16178,7 +16178,7 @@
         </w:numPr>
         <w:spacing w:after="60"/>
       </w:pPr>
-      <w:hyperlink w:history="1" r:id="rIdwy8ozsg1u9co6ydfwqlpa">
+      <w:hyperlink w:history="1" r:id="rIddlfkcyuln_lvquosv9keq">
         <w:r>
           <w:rPr>
             <w:sz w:val="18"/>
@@ -16206,7 +16206,7 @@
         </w:numPr>
         <w:spacing w:after="60"/>
       </w:pPr>
-      <w:hyperlink w:history="1" r:id="rIdmsa2anxrcgeczt1in_chr">
+      <w:hyperlink w:history="1" r:id="rIdd9ots5kht0dgdvdokeaxv">
         <w:r>
           <w:rPr>
             <w:sz w:val="18"/>
@@ -16234,7 +16234,7 @@
         </w:numPr>
         <w:spacing w:after="60"/>
       </w:pPr>
-      <w:hyperlink w:history="1" r:id="rIdwoqch0cts_9deovfl_p9w">
+      <w:hyperlink w:history="1" r:id="rId9xr9yufiffnnfze66pzxa">
         <w:r>
           <w:rPr>
             <w:sz w:val="18"/>
@@ -16262,7 +16262,7 @@
         </w:numPr>
         <w:spacing w:after="60"/>
       </w:pPr>
-      <w:hyperlink w:history="1" r:id="rId6uioebxxlfneoulk-u6ef">
+      <w:hyperlink w:history="1" r:id="rIdlqatfjtk4-rttovrwvjf2">
         <w:r>
           <w:rPr>
             <w:sz w:val="18"/>
@@ -16290,7 +16290,7 @@
         </w:numPr>
         <w:spacing w:after="60"/>
       </w:pPr>
-      <w:hyperlink w:history="1" r:id="rIduzjnlgugidmmbi77bjrkp">
+      <w:hyperlink w:history="1" r:id="rIdkckwiat3ehiyvukobodbd">
         <w:r>
           <w:rPr>
             <w:sz w:val="18"/>
@@ -16318,7 +16318,7 @@
         </w:numPr>
         <w:spacing w:after="60"/>
       </w:pPr>
-      <w:hyperlink w:history="1" r:id="rIdzkfme_pnm0175-4y30a59">
+      <w:hyperlink w:history="1" r:id="rId5gmqeavwznpwwllcc71dd">
         <w:r>
           <w:rPr>
             <w:sz w:val="18"/>
@@ -16346,7 +16346,7 @@
         </w:numPr>
         <w:spacing w:after="60"/>
       </w:pPr>
-      <w:hyperlink w:history="1" r:id="rId-leofsw7vy9p0vpjlhf4e">
+      <w:hyperlink w:history="1" r:id="rIdrx6qgu2yu8qfamskybhrc">
         <w:r>
           <w:rPr>
             <w:sz w:val="18"/>
@@ -16374,7 +16374,7 @@
         </w:numPr>
         <w:spacing w:after="60"/>
       </w:pPr>
-      <w:hyperlink w:history="1" r:id="rId5hc9geeadbg_88jq1wvsq">
+      <w:hyperlink w:history="1" r:id="rId60x7w1suujmjozz1zin9o">
         <w:r>
           <w:rPr>
             <w:sz w:val="18"/>
@@ -16402,7 +16402,7 @@
         </w:numPr>
         <w:spacing w:after="60"/>
       </w:pPr>
-      <w:hyperlink w:history="1" r:id="rIdfizkjti_wk0hudof4y9yc">
+      <w:hyperlink w:history="1" r:id="rIdzenyo4q_mtwp1xqik6bcw">
         <w:r>
           <w:rPr>
             <w:sz w:val="18"/>
@@ -16430,7 +16430,7 @@
         </w:numPr>
         <w:spacing w:after="60"/>
       </w:pPr>
-      <w:hyperlink w:history="1" r:id="rIdt-02bgciq4tio857izjcd">
+      <w:hyperlink w:history="1" r:id="rIdn2ze6fi1sfl2sqxeaidxd">
         <w:r>
           <w:rPr>
             <w:sz w:val="18"/>
@@ -16458,7 +16458,7 @@
         </w:numPr>
         <w:spacing w:after="60"/>
       </w:pPr>
-      <w:hyperlink w:history="1" r:id="rIdaymqlswmosjillfrrcpnx">
+      <w:hyperlink w:history="1" r:id="rIdx_udjopttudxqadbhwvxe">
         <w:r>
           <w:rPr>
             <w:sz w:val="18"/>
@@ -16486,7 +16486,7 @@
         </w:numPr>
         <w:spacing w:after="60"/>
       </w:pPr>
-      <w:hyperlink w:history="1" r:id="rId364-z98yynggltettsffl">
+      <w:hyperlink w:history="1" r:id="rIddudzs3jty8dealfcmdcxm">
         <w:r>
           <w:rPr>
             <w:sz w:val="18"/>
@@ -16514,7 +16514,7 @@
         </w:numPr>
         <w:spacing w:after="60"/>
       </w:pPr>
-      <w:hyperlink w:history="1" r:id="rIdzgryobuw6wmpqfkwiu3gz">
+      <w:hyperlink w:history="1" r:id="rIde4rvpp087dkl_s9zyee6j">
         <w:r>
           <w:rPr>
             <w:sz w:val="18"/>
@@ -16542,7 +16542,7 @@
         </w:numPr>
         <w:spacing w:after="60"/>
       </w:pPr>
-      <w:hyperlink w:history="1" r:id="rIdyw4ucsbqjutgwde7f-e1e">
+      <w:hyperlink w:history="1" r:id="rIdxutwir9-w75cuupt7ypgy">
         <w:r>
           <w:rPr>
             <w:sz w:val="18"/>
@@ -16570,7 +16570,7 @@
         </w:numPr>
         <w:spacing w:after="60"/>
       </w:pPr>
-      <w:hyperlink w:history="1" r:id="rId8crftpgjt_eup_0fmufqt">
+      <w:hyperlink w:history="1" r:id="rIdj7udz8gahwphpwgbmwanv">
         <w:r>
           <w:rPr>
             <w:sz w:val="18"/>
@@ -16598,7 +16598,7 @@
         </w:numPr>
         <w:spacing w:after="60"/>
       </w:pPr>
-      <w:hyperlink w:history="1" r:id="rIdzzzewgjisbo56nha9svri">
+      <w:hyperlink w:history="1" r:id="rIdye8mysxd-aopgyvsfblse">
         <w:r>
           <w:rPr>
             <w:sz w:val="18"/>
@@ -16626,7 +16626,7 @@
         </w:numPr>
         <w:spacing w:after="60"/>
       </w:pPr>
-      <w:hyperlink w:history="1" r:id="rIdiycpdl6wfl4polk9esnph">
+      <w:hyperlink w:history="1" r:id="rIdgqeowevp4uejnr4x88tw2">
         <w:r>
           <w:rPr>
             <w:sz w:val="18"/>
@@ -16654,7 +16654,7 @@
         </w:numPr>
         <w:spacing w:after="60"/>
       </w:pPr>
-      <w:hyperlink w:history="1" r:id="rId7uczvx3a8qvkocwsiwhok">
+      <w:hyperlink w:history="1" r:id="rIdbewztrgwcpw02tmxe55iz">
         <w:r>
           <w:rPr>
             <w:sz w:val="18"/>
@@ -16682,7 +16682,7 @@
         </w:numPr>
         <w:spacing w:after="60"/>
       </w:pPr>
-      <w:hyperlink w:history="1" r:id="rIdilwateusz2v8rbcemqsnt">
+      <w:hyperlink w:history="1" r:id="rId-zxb2navfcpvzg637muxh">
         <w:r>
           <w:rPr>
             <w:sz w:val="18"/>
@@ -16710,7 +16710,7 @@
         </w:numPr>
         <w:spacing w:after="60"/>
       </w:pPr>
-      <w:hyperlink w:history="1" r:id="rIdpsqdhmlxg6qfxapyc4qac">
+      <w:hyperlink w:history="1" r:id="rIdpcx2ciz31-k8dlowk51f1">
         <w:r>
           <w:rPr>
             <w:sz w:val="18"/>
@@ -16738,7 +16738,7 @@
         </w:numPr>
         <w:spacing w:after="60"/>
       </w:pPr>
-      <w:hyperlink w:history="1" r:id="rId4pgocudnlb0djwervc6b_">
+      <w:hyperlink w:history="1" r:id="rIdfu91rieoiiw7oyfau0r9z">
         <w:r>
           <w:rPr>
             <w:sz w:val="18"/>
@@ -16766,7 +16766,7 @@
         </w:numPr>
         <w:spacing w:after="60"/>
       </w:pPr>
-      <w:hyperlink w:history="1" r:id="rIdqwhttkhhbji3tpdz8vwen">
+      <w:hyperlink w:history="1" r:id="rIddayjf4dlp5aaeu1kwm-hv">
         <w:r>
           <w:rPr>
             <w:sz w:val="18"/>
@@ -16794,7 +16794,7 @@
         </w:numPr>
         <w:spacing w:after="60"/>
       </w:pPr>
-      <w:hyperlink w:history="1" r:id="rId8kxtgviafilve24clcuxd">
+      <w:hyperlink w:history="1" r:id="rIddr1syufg6pdkpjmgnskn7">
         <w:r>
           <w:rPr>
             <w:sz w:val="18"/>
@@ -16822,7 +16822,7 @@
         </w:numPr>
         <w:spacing w:after="60"/>
       </w:pPr>
-      <w:hyperlink w:history="1" r:id="rIdpb8urak9ixshty98kjjv7">
+      <w:hyperlink w:history="1" r:id="rIddpb_aqhkqnhigrcpcxosn">
         <w:r>
           <w:rPr>
             <w:sz w:val="18"/>
@@ -16850,7 +16850,7 @@
         </w:numPr>
         <w:spacing w:after="60"/>
       </w:pPr>
-      <w:hyperlink w:history="1" r:id="rIdw6kmzxoicl1_zmg64cevs">
+      <w:hyperlink w:history="1" r:id="rId8ky-bnxpfyvcybjql_r5j">
         <w:r>
           <w:rPr>
             <w:sz w:val="18"/>
@@ -16878,7 +16878,7 @@
         </w:numPr>
         <w:spacing w:after="60"/>
       </w:pPr>
-      <w:hyperlink w:history="1" r:id="rId25okdun7-ubomozygqjik">
+      <w:hyperlink w:history="1" r:id="rIdakrfpxhzpe3tdvpukcv5j">
         <w:r>
           <w:rPr>
             <w:sz w:val="18"/>
@@ -16906,7 +16906,7 @@
         </w:numPr>
         <w:spacing w:after="60"/>
       </w:pPr>
-      <w:hyperlink w:history="1" r:id="rIdstizaunj_ccu_dgogamo8">
+      <w:hyperlink w:history="1" r:id="rId8nhnaccnpop7vhnrigitq">
         <w:r>
           <w:rPr>
             <w:sz w:val="18"/>
@@ -16934,7 +16934,7 @@
         </w:numPr>
         <w:spacing w:after="60"/>
       </w:pPr>
-      <w:hyperlink w:history="1" r:id="rIdmaccrlwyfan6fhetocfhs">
+      <w:hyperlink w:history="1" r:id="rIddgjt-ylcxjyl6unbf2ghh">
         <w:r>
           <w:rPr>
             <w:sz w:val="18"/>
@@ -16962,7 +16962,7 @@
         </w:numPr>
         <w:spacing w:after="60"/>
       </w:pPr>
-      <w:hyperlink w:history="1" r:id="rIdo8hbo4wkz0ripxltnfycb">
+      <w:hyperlink w:history="1" r:id="rIdhfvac2l4lu35q_6ttlsup">
         <w:r>
           <w:rPr>
             <w:sz w:val="18"/>
@@ -16990,7 +16990,7 @@
         </w:numPr>
         <w:spacing w:after="60"/>
       </w:pPr>
-      <w:hyperlink w:history="1" r:id="rIdoplkifb4zg7mxkra8do0n">
+      <w:hyperlink w:history="1" r:id="rId9hoiujdqusosyqxizpywt">
         <w:r>
           <w:rPr>
             <w:sz w:val="18"/>
@@ -17018,7 +17018,7 @@
         </w:numPr>
         <w:spacing w:after="60"/>
       </w:pPr>
-      <w:hyperlink w:history="1" r:id="rIdq1-jcn2crpgwmp7bvq1tu">
+      <w:hyperlink w:history="1" r:id="rIdfgzy_6muover1tjsdod0h">
         <w:r>
           <w:rPr>
             <w:sz w:val="18"/>
@@ -17046,7 +17046,7 @@
         </w:numPr>
         <w:spacing w:after="60"/>
       </w:pPr>
-      <w:hyperlink w:history="1" r:id="rIdmzni-zf1mzkvoerbnvses">
+      <w:hyperlink w:history="1" r:id="rIdzflpj2pzykgrijdtusric">
         <w:r>
           <w:rPr>
             <w:sz w:val="18"/>
@@ -17074,7 +17074,7 @@
         </w:numPr>
         <w:spacing w:after="60"/>
       </w:pPr>
-      <w:hyperlink w:history="1" r:id="rIdkfasmcsnqhtgvu35pbjoj">
+      <w:hyperlink w:history="1" r:id="rId0wvu9wvan2zjx9vhnjtws">
         <w:r>
           <w:rPr>
             <w:sz w:val="18"/>
@@ -17102,7 +17102,7 @@
         </w:numPr>
         <w:spacing w:after="60"/>
       </w:pPr>
-      <w:hyperlink w:history="1" r:id="rId_ccqyc3etiwffhudl0q5b">
+      <w:hyperlink w:history="1" r:id="rIdy1khkwo8axnvzkfrbtx6_">
         <w:r>
           <w:rPr>
             <w:sz w:val="18"/>
@@ -17130,7 +17130,7 @@
         </w:numPr>
         <w:spacing w:after="60"/>
       </w:pPr>
-      <w:hyperlink w:history="1" r:id="rId70r55tw2rl_ygbwfssmov">
+      <w:hyperlink w:history="1" r:id="rIdhw1da3loxahcd7kov0_m2">
         <w:r>
           <w:rPr>
             <w:sz w:val="18"/>
@@ -17158,7 +17158,7 @@
         </w:numPr>
         <w:spacing w:after="60"/>
       </w:pPr>
-      <w:hyperlink w:history="1" r:id="rIdmajkro3gomdhzzn9ybqsd">
+      <w:hyperlink w:history="1" r:id="rIdwtkhxful_bsytm7p-o36z">
         <w:r>
           <w:rPr>
             <w:sz w:val="18"/>
@@ -17186,7 +17186,7 @@
         </w:numPr>
         <w:spacing w:after="60"/>
       </w:pPr>
-      <w:hyperlink w:history="1" r:id="rIdftlrioi8tauzcbof33gnk">
+      <w:hyperlink w:history="1" r:id="rIdkg6vnqq70puckkcckdbit">
         <w:r>
           <w:rPr>
             <w:sz w:val="18"/>
@@ -17214,7 +17214,7 @@
         </w:numPr>
         <w:spacing w:after="60"/>
       </w:pPr>
-      <w:hyperlink w:history="1" r:id="rId8andbtyqsamrilo5cssal">
+      <w:hyperlink w:history="1" r:id="rId1kcwt-clod-r968nc2lc_">
         <w:r>
           <w:rPr>
             <w:sz w:val="18"/>
@@ -17242,7 +17242,7 @@
         </w:numPr>
         <w:spacing w:after="60"/>
       </w:pPr>
-      <w:hyperlink w:history="1" r:id="rIdvdsdv94simfdtyboar0rb">
+      <w:hyperlink w:history="1" r:id="rIduvk-p1pjby2yway7_ersk">
         <w:r>
           <w:rPr>
             <w:sz w:val="18"/>
@@ -17270,7 +17270,7 @@
         </w:numPr>
         <w:spacing w:after="60"/>
       </w:pPr>
-      <w:hyperlink w:history="1" r:id="rIdnecdkcchkyajc0ohsj8vk">
+      <w:hyperlink w:history="1" r:id="rIdzmxsu-o3ry9ci3dql6obq">
         <w:r>
           <w:rPr>
             <w:sz w:val="18"/>
@@ -17298,7 +17298,7 @@
         </w:numPr>
         <w:spacing w:after="60"/>
       </w:pPr>
-      <w:hyperlink w:history="1" r:id="rIdybngl_gxoehowwsfcty0t">
+      <w:hyperlink w:history="1" r:id="rId2hcyjvr-m_x8tecmkqolr">
         <w:r>
           <w:rPr>
             <w:sz w:val="18"/>
@@ -17326,7 +17326,7 @@
         </w:numPr>
         <w:spacing w:after="60"/>
       </w:pPr>
-      <w:hyperlink w:history="1" r:id="rIdk4_wygu0fkgy3bcizwuwu">
+      <w:hyperlink w:history="1" r:id="rIdeeau3f4eabs_htyc4lgfy">
         <w:r>
           <w:rPr>
             <w:sz w:val="18"/>
@@ -17354,7 +17354,7 @@
         </w:numPr>
         <w:spacing w:after="60"/>
       </w:pPr>
-      <w:hyperlink w:history="1" r:id="rIdrbeu8xnbwqbfneapf7x1b">
+      <w:hyperlink w:history="1" r:id="rIds4frizfm3-m4a-f3z5dq9">
         <w:r>
           <w:rPr>
             <w:sz w:val="18"/>
@@ -17382,7 +17382,7 @@
         </w:numPr>
         <w:spacing w:after="60"/>
       </w:pPr>
-      <w:hyperlink w:history="1" r:id="rIdfakeof3h20opnzcijssfs">
+      <w:hyperlink w:history="1" r:id="rIdhgoomlyofowchjl7wj40b">
         <w:r>
           <w:rPr>
             <w:sz w:val="18"/>
@@ -17410,7 +17410,7 @@
         </w:numPr>
         <w:spacing w:after="60"/>
       </w:pPr>
-      <w:hyperlink w:history="1" r:id="rIdcmvrpnq5lf7c5xneubyal">
+      <w:hyperlink w:history="1" r:id="rIdgciqhtbjpvwdafouasgh7">
         <w:r>
           <w:rPr>
             <w:sz w:val="18"/>
@@ -17438,7 +17438,7 @@
         </w:numPr>
         <w:spacing w:after="60"/>
       </w:pPr>
-      <w:hyperlink w:history="1" r:id="rIdcaqkbdfk9os61xva3acwa">
+      <w:hyperlink w:history="1" r:id="rIdkm2i7b_amrsf1uqlypz2i">
         <w:r>
           <w:rPr>
             <w:sz w:val="18"/>
@@ -17466,7 +17466,7 @@
         </w:numPr>
         <w:spacing w:after="60"/>
       </w:pPr>
-      <w:hyperlink w:history="1" r:id="rIdyrgwysnim-9tv7hx1hvm4">
+      <w:hyperlink w:history="1" r:id="rIdymzln8xrmslcjqmyaoign">
         <w:r>
           <w:rPr>
             <w:sz w:val="18"/>
@@ -17494,7 +17494,7 @@
         </w:numPr>
         <w:spacing w:after="60"/>
       </w:pPr>
-      <w:hyperlink w:history="1" r:id="rIdbmvypw2qdx0sz7uxepwss">
+      <w:hyperlink w:history="1" r:id="rId9xuozjuygsujws27rnpsy">
         <w:r>
           <w:rPr>
             <w:sz w:val="18"/>
@@ -17522,7 +17522,7 @@
         </w:numPr>
         <w:spacing w:after="60"/>
       </w:pPr>
-      <w:hyperlink w:history="1" r:id="rIdwp2msvznkwc9k7mxeg2yl">
+      <w:hyperlink w:history="1" r:id="rIdzfeiddpccbqvllzloylja">
         <w:r>
           <w:rPr>
             <w:sz w:val="18"/>
@@ -17550,7 +17550,7 @@
         </w:numPr>
         <w:spacing w:after="60"/>
       </w:pPr>
-      <w:hyperlink w:history="1" r:id="rIdveg7gl0kfxjpi9_gnnxhy">
+      <w:hyperlink w:history="1" r:id="rIdsdrn2ybcpw6ryfcomx8ae">
         <w:r>
           <w:rPr>
             <w:sz w:val="18"/>
@@ -17578,7 +17578,7 @@
         </w:numPr>
         <w:spacing w:after="60"/>
       </w:pPr>
-      <w:hyperlink w:history="1" r:id="rIdidmnyfozrkewgw8ozvnhf">
+      <w:hyperlink w:history="1" r:id="rIddihtktom2o9i6akfympir">
         <w:r>
           <w:rPr>
             <w:sz w:val="18"/>
@@ -17606,7 +17606,7 @@
         </w:numPr>
         <w:spacing w:after="60"/>
       </w:pPr>
-      <w:hyperlink w:history="1" r:id="rIdi6nnywfzylkgyufhmvt2r">
+      <w:hyperlink w:history="1" r:id="rIdoktruu2oawivnooxs7kka">
         <w:r>
           <w:rPr>
             <w:sz w:val="18"/>
@@ -17634,7 +17634,7 @@
         </w:numPr>
         <w:spacing w:after="60"/>
       </w:pPr>
-      <w:hyperlink w:history="1" r:id="rIdd5fttyiag2rxiz6au3wjx">
+      <w:hyperlink w:history="1" r:id="rIdrwh6l5gaoy7_sliwo6dzk">
         <w:r>
           <w:rPr>
             <w:sz w:val="18"/>
@@ -17662,7 +17662,7 @@
         </w:numPr>
         <w:spacing w:after="60"/>
       </w:pPr>
-      <w:hyperlink w:history="1" r:id="rIdotjourq4wpkkb3uetmukj">
+      <w:hyperlink w:history="1" r:id="rId2yiec3vmdk9rezphltcob">
         <w:r>
           <w:rPr>
             <w:sz w:val="18"/>
@@ -17690,7 +17690,7 @@
         </w:numPr>
         <w:spacing w:after="60"/>
       </w:pPr>
-      <w:hyperlink w:history="1" r:id="rId-xv5t8lbn6lctsk8div52">
+      <w:hyperlink w:history="1" r:id="rIdqblydyieyklz5dddtoscd">
         <w:r>
           <w:rPr>
             <w:sz w:val="18"/>
@@ -17718,7 +17718,7 @@
         </w:numPr>
         <w:spacing w:after="60"/>
       </w:pPr>
-      <w:hyperlink w:history="1" r:id="rIdlur36y_3cbm3atervjbik">
+      <w:hyperlink w:history="1" r:id="rIdcvr2neomxzlqnujbim86r">
         <w:r>
           <w:rPr>
             <w:sz w:val="18"/>
@@ -17746,7 +17746,7 @@
         </w:numPr>
         <w:spacing w:after="60"/>
       </w:pPr>
-      <w:hyperlink w:history="1" r:id="rIdpzujom0hnx019gwk7vbp_">
+      <w:hyperlink w:history="1" r:id="rIdqdvzjmyiytifew1lv5hlr">
         <w:r>
           <w:rPr>
             <w:sz w:val="18"/>
@@ -17774,7 +17774,7 @@
         </w:numPr>
         <w:spacing w:after="60"/>
       </w:pPr>
-      <w:hyperlink w:history="1" r:id="rIdfb7dl_yim3wtmcxaw6zq2">
+      <w:hyperlink w:history="1" r:id="rIdifqbw8gr0axqo0ung2iql">
         <w:r>
           <w:rPr>
             <w:sz w:val="18"/>
@@ -17802,7 +17802,7 @@
         </w:numPr>
         <w:spacing w:after="60"/>
       </w:pPr>
-      <w:hyperlink w:history="1" r:id="rId-neiejxpqar3sut5lnzxw">
+      <w:hyperlink w:history="1" r:id="rIdotupzazteivz6wjq3jgve">
         <w:r>
           <w:rPr>
             <w:sz w:val="18"/>
@@ -17830,7 +17830,7 @@
         </w:numPr>
         <w:spacing w:after="60"/>
       </w:pPr>
-      <w:hyperlink w:history="1" r:id="rIdho6eoyu8xb13ctcnzu4lb">
+      <w:hyperlink w:history="1" r:id="rId0obetm6ddaszdgminoceg">
         <w:r>
           <w:rPr>
             <w:sz w:val="18"/>
@@ -17858,7 +17858,7 @@
         </w:numPr>
         <w:spacing w:after="60"/>
       </w:pPr>
-      <w:hyperlink w:history="1" r:id="rIdseb7_gfq2vwhy9j-3pl0s">
+      <w:hyperlink w:history="1" r:id="rIduio5jjfudnqwlygexd6l4">
         <w:r>
           <w:rPr>
             <w:sz w:val="18"/>
@@ -17886,7 +17886,7 @@
         </w:numPr>
         <w:spacing w:after="60"/>
       </w:pPr>
-      <w:hyperlink w:history="1" r:id="rId1bclmlyrazfivoqjdbr0z">
+      <w:hyperlink w:history="1" r:id="rIdx3gti1nlmus6a1woocjvb">
         <w:r>
           <w:rPr>
             <w:sz w:val="18"/>
@@ -17914,7 +17914,7 @@
         </w:numPr>
         <w:spacing w:after="60"/>
       </w:pPr>
-      <w:hyperlink w:history="1" r:id="rIdcdnantoejii6eszwem4vi">
+      <w:hyperlink w:history="1" r:id="rIdf1nvvqjapgnxmrp1xbzj7">
         <w:r>
           <w:rPr>
             <w:sz w:val="18"/>
@@ -17942,7 +17942,7 @@
         </w:numPr>
         <w:spacing w:after="60"/>
       </w:pPr>
-      <w:hyperlink w:history="1" r:id="rIdzevyzjmh5vl2uj1qshvgj">
+      <w:hyperlink w:history="1" r:id="rId7vpctpaxnzn8a4ldswpjf">
         <w:r>
           <w:rPr>
             <w:sz w:val="18"/>
@@ -17970,7 +17970,7 @@
         </w:numPr>
         <w:spacing w:after="60"/>
       </w:pPr>
-      <w:hyperlink w:history="1" r:id="rIdnqqrqqbluezphhtsqkgxr">
+      <w:hyperlink w:history="1" r:id="rIdeody-arrudzae6o60-4ne">
         <w:r>
           <w:rPr>
             <w:sz w:val="18"/>
@@ -17998,7 +17998,7 @@
         </w:numPr>
         <w:spacing w:after="60"/>
       </w:pPr>
-      <w:hyperlink w:history="1" r:id="rIdpxo1d8qoiayh7wagvcrzi">
+      <w:hyperlink w:history="1" r:id="rIdrxleww4pdnnbaol12hguq">
         <w:r>
           <w:rPr>
             <w:sz w:val="18"/>
@@ -18026,7 +18026,7 @@
         </w:numPr>
         <w:spacing w:after="60"/>
       </w:pPr>
-      <w:hyperlink w:history="1" r:id="rIdpytgtbeg_alrhvzbvb93w">
+      <w:hyperlink w:history="1" r:id="rIdypzwxmjoidrk-15vbt4c-">
         <w:r>
           <w:rPr>
             <w:sz w:val="18"/>
@@ -18054,7 +18054,7 @@
         </w:numPr>
         <w:spacing w:after="60"/>
       </w:pPr>
-      <w:hyperlink w:history="1" r:id="rIdcvvuolve5ybfulfwbp1jy">
+      <w:hyperlink w:history="1" r:id="rIdgtl-ndmqbc1yypwpuvi3d">
         <w:r>
           <w:rPr>
             <w:sz w:val="18"/>
@@ -18082,7 +18082,7 @@
         </w:numPr>
         <w:spacing w:after="60"/>
       </w:pPr>
-      <w:hyperlink w:history="1" r:id="rId9r0xnb-is0ssvwcyl_dld">
+      <w:hyperlink w:history="1" r:id="rIdpvnmamhg1bd1sbgpsmcec">
         <w:r>
           <w:rPr>
             <w:sz w:val="18"/>
@@ -18110,7 +18110,7 @@
         </w:numPr>
         <w:spacing w:after="60"/>
       </w:pPr>
-      <w:hyperlink w:history="1" r:id="rIdx2tjfj8ciptk7gjxoqdsf">
+      <w:hyperlink w:history="1" r:id="rIdngo8nqac6j6cxgjtsjdpe">
         <w:r>
           <w:rPr>
             <w:sz w:val="18"/>
@@ -18138,7 +18138,7 @@
         </w:numPr>
         <w:spacing w:after="60"/>
       </w:pPr>
-      <w:hyperlink w:history="1" r:id="rId-kehj4kleql_usgpawmqu">
+      <w:hyperlink w:history="1" r:id="rIdpg12cexeqyzwonamorjfg">
         <w:r>
           <w:rPr>
             <w:sz w:val="18"/>
@@ -18166,7 +18166,7 @@
         </w:numPr>
         <w:spacing w:after="60"/>
       </w:pPr>
-      <w:hyperlink w:history="1" r:id="rIdhq12mgjjpx9b_rxfrlvr_">
+      <w:hyperlink w:history="1" r:id="rIdbe1nit38dnsku0isol27g">
         <w:r>
           <w:rPr>
             <w:sz w:val="18"/>
@@ -18194,7 +18194,7 @@
         </w:numPr>
         <w:spacing w:after="60"/>
       </w:pPr>
-      <w:hyperlink w:history="1" r:id="rId7pmyvzarwuoxsif6u3ptl">
+      <w:hyperlink w:history="1" r:id="rId5qqivsypjbrmy39bsyara">
         <w:r>
           <w:rPr>
             <w:sz w:val="18"/>
@@ -18222,7 +18222,7 @@
         </w:numPr>
         <w:spacing w:after="60"/>
       </w:pPr>
-      <w:hyperlink w:history="1" r:id="rIdlhgzlq1v8nvd2a22mshn4">
+      <w:hyperlink w:history="1" r:id="rIdjatop9x2wx_kje1w2tj9h">
         <w:r>
           <w:rPr>
             <w:sz w:val="18"/>
@@ -18250,7 +18250,7 @@
         </w:numPr>
         <w:spacing w:after="60"/>
       </w:pPr>
-      <w:hyperlink w:history="1" r:id="rId2sn8pabag_aira8eyb9na">
+      <w:hyperlink w:history="1" r:id="rId6vcegsyuszqq9mqv9bqco">
         <w:r>
           <w:rPr>
             <w:sz w:val="18"/>
@@ -18278,7 +18278,7 @@
         </w:numPr>
         <w:spacing w:after="60"/>
       </w:pPr>
-      <w:hyperlink w:history="1" r:id="rIdlals6wpi_ha0vksu2ez-u">
+      <w:hyperlink w:history="1" r:id="rId1jgbtha5zcy6qbrmkwf6r">
         <w:r>
           <w:rPr>
             <w:sz w:val="18"/>
@@ -18306,7 +18306,7 @@
         </w:numPr>
         <w:spacing w:after="60"/>
       </w:pPr>
-      <w:hyperlink w:history="1" r:id="rIdopg6np3-alrkft_hqplv5">
+      <w:hyperlink w:history="1" r:id="rIdmkq6lzmkc9wr7-p8hzzxo">
         <w:r>
           <w:rPr>
             <w:sz w:val="18"/>
@@ -18334,7 +18334,7 @@
         </w:numPr>
         <w:spacing w:after="60"/>
       </w:pPr>
-      <w:hyperlink w:history="1" r:id="rIdq2tc9ftss941g4jfpcnz7">
+      <w:hyperlink w:history="1" r:id="rIdau_rwf3rgtebpbqn8huyf">
         <w:r>
           <w:rPr>
             <w:sz w:val="18"/>
@@ -18362,7 +18362,7 @@
         </w:numPr>
         <w:spacing w:after="60"/>
       </w:pPr>
-      <w:hyperlink w:history="1" r:id="rIdlk3udweihhiuyfha7vqhz">
+      <w:hyperlink w:history="1" r:id="rIdxa-hpgzk2ndbvjjmlljgu">
         <w:r>
           <w:rPr>
             <w:sz w:val="18"/>
@@ -18390,7 +18390,7 @@
         </w:numPr>
         <w:spacing w:after="60"/>
       </w:pPr>
-      <w:hyperlink w:history="1" r:id="rIddakeipiusilluvwmx3aoz">
+      <w:hyperlink w:history="1" r:id="rIdfdvpwbktlfkstz_c1cufm">
         <w:r>
           <w:rPr>
             <w:sz w:val="18"/>
@@ -18418,7 +18418,7 @@
         </w:numPr>
         <w:spacing w:after="60"/>
       </w:pPr>
-      <w:hyperlink w:history="1" r:id="rIdsmxrtu7ueplwmrsoc6jid">
+      <w:hyperlink w:history="1" r:id="rIdpr55jkvcolkuw8-v6csmx">
         <w:r>
           <w:rPr>
             <w:sz w:val="18"/>
@@ -18446,7 +18446,7 @@
         </w:numPr>
         <w:spacing w:after="60"/>
       </w:pPr>
-      <w:hyperlink w:history="1" r:id="rIdjfqmm8byfixr9iw9r8qjh">
+      <w:hyperlink w:history="1" r:id="rIdaqtglqk_au_fx5icpqv26">
         <w:r>
           <w:rPr>
             <w:sz w:val="18"/>
@@ -18474,7 +18474,7 @@
         </w:numPr>
         <w:spacing w:after="60"/>
       </w:pPr>
-      <w:hyperlink w:history="1" r:id="rId0q1htfsvilbiqvi9s2-m8">
+      <w:hyperlink w:history="1" r:id="rIdsmtb9uudjzlk4j2hki4yr">
         <w:r>
           <w:rPr>
             <w:sz w:val="18"/>
@@ -18502,7 +18502,7 @@
         </w:numPr>
         <w:spacing w:after="60"/>
       </w:pPr>
-      <w:hyperlink w:history="1" r:id="rId755rbji4dn0zbcxloippb">
+      <w:hyperlink w:history="1" r:id="rIdgyzzxbetfzmtm4qt-3lk7">
         <w:r>
           <w:rPr>
             <w:sz w:val="18"/>
@@ -18530,7 +18530,7 @@
         </w:numPr>
         <w:spacing w:after="60"/>
       </w:pPr>
-      <w:hyperlink w:history="1" r:id="rId8gfq82lvqrwg8uaswgf6b">
+      <w:hyperlink w:history="1" r:id="rIdivdl7qpxybejbeasrjsxn">
         <w:r>
           <w:rPr>
             <w:sz w:val="18"/>
@@ -18558,7 +18558,7 @@
         </w:numPr>
         <w:spacing w:after="60"/>
       </w:pPr>
-      <w:hyperlink w:history="1" r:id="rIdzww0tqvpprcxdgluev_pa">
+      <w:hyperlink w:history="1" r:id="rIdnsgg1bsqcugvozl21fiti">
         <w:r>
           <w:rPr>
             <w:sz w:val="18"/>
@@ -18586,7 +18586,7 @@
         </w:numPr>
         <w:spacing w:after="60"/>
       </w:pPr>
-      <w:hyperlink w:history="1" r:id="rId6m3pl_cdgpr7dyzduid5f">
+      <w:hyperlink w:history="1" r:id="rIdy9ld4jwif3zfjse_gzo2f">
         <w:r>
           <w:rPr>
             <w:sz w:val="18"/>
@@ -18614,7 +18614,7 @@
         </w:numPr>
         <w:spacing w:after="60"/>
       </w:pPr>
-      <w:hyperlink w:history="1" r:id="rIdrk3dcndt3o0tsjxmidl0l">
+      <w:hyperlink w:history="1" r:id="rId2hunsxbgj-nxm4vp8qv4y">
         <w:r>
           <w:rPr>
             <w:sz w:val="18"/>
@@ -18642,7 +18642,7 @@
         </w:numPr>
         <w:spacing w:after="60"/>
       </w:pPr>
-      <w:hyperlink w:history="1" r:id="rIdq8aai-2moqtomuwhcqvom">
+      <w:hyperlink w:history="1" r:id="rIdx3_jfyqkbz1zboktswewe">
         <w:r>
           <w:rPr>
             <w:sz w:val="18"/>
@@ -18670,7 +18670,7 @@
         </w:numPr>
         <w:spacing w:after="60"/>
       </w:pPr>
-      <w:hyperlink w:history="1" r:id="rIddvpc01blazlrl9gtb8pht">
+      <w:hyperlink w:history="1" r:id="rIdkllgqxhdw5vcl-n6efh9z">
         <w:r>
           <w:rPr>
             <w:sz w:val="18"/>
@@ -18698,7 +18698,7 @@
         </w:numPr>
         <w:spacing w:after="60"/>
       </w:pPr>
-      <w:hyperlink w:history="1" r:id="rIddzjdsd6wr6hgabu2xw7ov">
+      <w:hyperlink w:history="1" r:id="rIdceeeaueci6unwr4ytpki_">
         <w:r>
           <w:rPr>
             <w:sz w:val="18"/>
@@ -18726,7 +18726,7 @@
         </w:numPr>
         <w:spacing w:after="60"/>
       </w:pPr>
-      <w:hyperlink w:history="1" r:id="rId-niwz8g_hbe99xt0g4n1t">
+      <w:hyperlink w:history="1" r:id="rIdix63xkwse-ju7m94plagi">
         <w:r>
           <w:rPr>
             <w:sz w:val="18"/>
@@ -18754,7 +18754,7 @@
         </w:numPr>
         <w:spacing w:after="60"/>
       </w:pPr>
-      <w:hyperlink w:history="1" r:id="rId5vywnocf2vnqhrwsccwtd">
+      <w:hyperlink w:history="1" r:id="rIdce3gv50ddpxzf_rkyc2uw">
         <w:r>
           <w:rPr>
             <w:sz w:val="18"/>
@@ -18782,7 +18782,7 @@
         </w:numPr>
         <w:spacing w:after="60"/>
       </w:pPr>
-      <w:hyperlink w:history="1" r:id="rIds9_pnmzh-qsztr3_b9hzi">
+      <w:hyperlink w:history="1" r:id="rIdlzdili4o1cpwhdk6bqltr">
         <w:r>
           <w:rPr>
             <w:sz w:val="18"/>
@@ -18810,7 +18810,7 @@
         </w:numPr>
         <w:spacing w:after="60"/>
       </w:pPr>
-      <w:hyperlink w:history="1" r:id="rIdhhz9pi8-ied4yq36omv4b">
+      <w:hyperlink w:history="1" r:id="rIdxueckjpcshgth6e8uyo7h">
         <w:r>
           <w:rPr>
             <w:sz w:val="18"/>
@@ -18838,7 +18838,7 @@
         </w:numPr>
         <w:spacing w:after="60"/>
       </w:pPr>
-      <w:hyperlink w:history="1" r:id="rIdrusqbttabkes-bjjclkxf">
+      <w:hyperlink w:history="1" r:id="rIdv6k40xjvgqtc0rrd0z8zb">
         <w:r>
           <w:rPr>
             <w:sz w:val="18"/>
@@ -18866,7 +18866,7 @@
         </w:numPr>
         <w:spacing w:after="60"/>
       </w:pPr>
-      <w:hyperlink w:history="1" r:id="rIdga2gal8abjdr6rkwvzu6j">
+      <w:hyperlink w:history="1" r:id="rIdzttura6q_wcuqtanoazcc">
         <w:r>
           <w:rPr>
             <w:sz w:val="18"/>
@@ -18894,7 +18894,7 @@
         </w:numPr>
         <w:spacing w:after="60"/>
       </w:pPr>
-      <w:hyperlink w:history="1" r:id="rIdsjs65budhauvvsdmidrv4">
+      <w:hyperlink w:history="1" r:id="rIdzcr8scdzdjsgdm4u8qmuz">
         <w:r>
           <w:rPr>
             <w:sz w:val="18"/>
@@ -18922,7 +18922,7 @@
         </w:numPr>
         <w:spacing w:after="60"/>
       </w:pPr>
-      <w:hyperlink w:history="1" r:id="rId-hpkk_zhffk6ijuhqryud">
+      <w:hyperlink w:history="1" r:id="rIdugc2rfofe58rigoicw4ta">
         <w:r>
           <w:rPr>
             <w:sz w:val="18"/>
@@ -18950,7 +18950,7 @@
         </w:numPr>
         <w:spacing w:after="60"/>
       </w:pPr>
-      <w:hyperlink w:history="1" r:id="rIdwdcd5ef8vdugwkwhls8f9">
+      <w:hyperlink w:history="1" r:id="rId5shfjcz8maaoniacpak9m">
         <w:r>
           <w:rPr>
             <w:sz w:val="18"/>
@@ -18978,7 +18978,7 @@
         </w:numPr>
         <w:spacing w:after="60"/>
       </w:pPr>
-      <w:hyperlink w:history="1" r:id="rIdp00rk4inbrtj01lch9y1k">
+      <w:hyperlink w:history="1" r:id="rIdqwwequrpr2mjmyeexxbsx">
         <w:r>
           <w:rPr>
             <w:sz w:val="18"/>
@@ -19006,7 +19006,7 @@
         </w:numPr>
         <w:spacing w:after="60"/>
       </w:pPr>
-      <w:hyperlink w:history="1" r:id="rIdtwrgqes_kuq0domcszalw">
+      <w:hyperlink w:history="1" r:id="rIdfy-tnwcmiqufbadjuxug4">
         <w:r>
           <w:rPr>
             <w:sz w:val="18"/>
@@ -19034,7 +19034,7 @@
         </w:numPr>
         <w:spacing w:after="60"/>
       </w:pPr>
-      <w:hyperlink w:history="1" r:id="rIdogppzkfziaxbhqcivaxfv">
+      <w:hyperlink w:history="1" r:id="rId3ztpdxpjzqu5ovdabnvgt">
         <w:r>
           <w:rPr>
             <w:sz w:val="18"/>
@@ -19062,7 +19062,7 @@
         </w:numPr>
         <w:spacing w:after="60"/>
       </w:pPr>
-      <w:hyperlink w:history="1" r:id="rIdfphgwpddgntbqw4x4axkf">
+      <w:hyperlink w:history="1" r:id="rIdm9wkbrpnauewjsfypbsuv">
         <w:r>
           <w:rPr>
             <w:sz w:val="18"/>
@@ -19090,7 +19090,7 @@
         </w:numPr>
         <w:spacing w:after="60"/>
       </w:pPr>
-      <w:hyperlink w:history="1" r:id="rIdc4cd60z-_kkyuavrie8oa">
+      <w:hyperlink w:history="1" r:id="rIdus1pht_xaywaptejopw2d">
         <w:r>
           <w:rPr>
             <w:sz w:val="18"/>
@@ -19118,7 +19118,7 @@
         </w:numPr>
         <w:spacing w:after="60"/>
       </w:pPr>
-      <w:hyperlink w:history="1" r:id="rIdqmfb2yssqfpb4scy0ys-x">
+      <w:hyperlink w:history="1" r:id="rIdnnei2ybsairbvhwbzuxn6">
         <w:r>
           <w:rPr>
             <w:sz w:val="18"/>
@@ -19146,7 +19146,7 @@
         </w:numPr>
         <w:spacing w:after="60"/>
       </w:pPr>
-      <w:hyperlink w:history="1" r:id="rIdwu9m3o9c1nxvxmjtbnlov">
+      <w:hyperlink w:history="1" r:id="rIdkgbh7xksl8atxtatlh4m2">
         <w:r>
           <w:rPr>
             <w:sz w:val="18"/>
@@ -19174,7 +19174,7 @@
         </w:numPr>
         <w:spacing w:after="60"/>
       </w:pPr>
-      <w:hyperlink w:history="1" r:id="rIdeipdxxoi5u_6am5nctj70">
+      <w:hyperlink w:history="1" r:id="rIdit0njf9ffy3k2a6kgorbv">
         <w:r>
           <w:rPr>
             <w:sz w:val="18"/>
@@ -19202,7 +19202,7 @@
         </w:numPr>
         <w:spacing w:after="60"/>
       </w:pPr>
-      <w:hyperlink w:history="1" r:id="rIdk8keybsfe7jgojyhtadl_">
+      <w:hyperlink w:history="1" r:id="rIdrfaqjz5qi2jqrjpycfr4q">
         <w:r>
           <w:rPr>
             <w:sz w:val="18"/>
@@ -19230,7 +19230,7 @@
         </w:numPr>
         <w:spacing w:after="60"/>
       </w:pPr>
-      <w:hyperlink w:history="1" r:id="rIdoybux6mey_lyzew-u5bbt">
+      <w:hyperlink w:history="1" r:id="rIdgzufwgra3qfeg0o2d6-uz">
         <w:r>
           <w:rPr>
             <w:sz w:val="18"/>
@@ -19258,7 +19258,7 @@
         </w:numPr>
         <w:spacing w:after="60"/>
       </w:pPr>
-      <w:hyperlink w:history="1" r:id="rId1alddkuinpzwzywglercg">
+      <w:hyperlink w:history="1" r:id="rIddgj5l1im4x_datv_1kaxu">
         <w:r>
           <w:rPr>
             <w:sz w:val="18"/>
@@ -19286,7 +19286,7 @@
         </w:numPr>
         <w:spacing w:after="60"/>
       </w:pPr>
-      <w:hyperlink w:history="1" r:id="rIderki_uyp68pwnv5pw2ltq">
+      <w:hyperlink w:history="1" r:id="rIdluejz401tyev8dcsnkfzl">
         <w:r>
           <w:rPr>
             <w:sz w:val="18"/>
@@ -19314,7 +19314,7 @@
         </w:numPr>
         <w:spacing w:after="60"/>
       </w:pPr>
-      <w:hyperlink w:history="1" r:id="rId96nl-ujymkjvpblx2sfwm">
+      <w:hyperlink w:history="1" r:id="rIdlfq2icl1j5yszw2idgwwz">
         <w:r>
           <w:rPr>
             <w:sz w:val="18"/>
@@ -19342,7 +19342,7 @@
         </w:numPr>
         <w:spacing w:after="60"/>
       </w:pPr>
-      <w:hyperlink w:history="1" r:id="rIdcqdrkn7qm2ad-ucuv2u8a">
+      <w:hyperlink w:history="1" r:id="rIdnsq6hflbflkwfq2qmzdx4">
         <w:r>
           <w:rPr>
             <w:sz w:val="18"/>
@@ -19370,7 +19370,7 @@
         </w:numPr>
         <w:spacing w:after="60"/>
       </w:pPr>
-      <w:hyperlink w:history="1" r:id="rIdzedjqz_hxw7i3_igxye5c">
+      <w:hyperlink w:history="1" r:id="rIdhpp7peuegrjbwvnfglrnc">
         <w:r>
           <w:rPr>
             <w:sz w:val="18"/>
@@ -19398,7 +19398,7 @@
         </w:numPr>
         <w:spacing w:after="60"/>
       </w:pPr>
-      <w:hyperlink w:history="1" r:id="rId8jph_-4fbwad-pfyuqofl">
+      <w:hyperlink w:history="1" r:id="rId2yb7ck6plq7kdc6zrd3tf">
         <w:r>
           <w:rPr>
             <w:sz w:val="18"/>
@@ -19426,7 +19426,7 @@
         </w:numPr>
         <w:spacing w:after="60"/>
       </w:pPr>
-      <w:hyperlink w:history="1" r:id="rIdc3wshehexqjdkbd3uecsi">
+      <w:hyperlink w:history="1" r:id="rIdzdx9v1e7k5jmsezeemmix">
         <w:r>
           <w:rPr>
             <w:sz w:val="18"/>
@@ -19454,7 +19454,7 @@
         </w:numPr>
         <w:spacing w:after="60"/>
       </w:pPr>
-      <w:hyperlink w:history="1" r:id="rId_idyjfy-z4a6_l7vabmql">
+      <w:hyperlink w:history="1" r:id="rIdww4kkg3iwmzemk_duh7rv">
         <w:r>
           <w:rPr>
             <w:sz w:val="18"/>
@@ -19482,7 +19482,7 @@
         </w:numPr>
         <w:spacing w:after="60"/>
       </w:pPr>
-      <w:hyperlink w:history="1" r:id="rIdazxkckqwmjvhpnf8fk6gr">
+      <w:hyperlink w:history="1" r:id="rId_lcqiiur4eabdbsxox_ux">
         <w:r>
           <w:rPr>
             <w:sz w:val="18"/>
@@ -19510,7 +19510,7 @@
         </w:numPr>
         <w:spacing w:after="60"/>
       </w:pPr>
-      <w:hyperlink w:history="1" r:id="rId9lm2i6kj4djoxeyipxdf9">
+      <w:hyperlink w:history="1" r:id="rIdiykgwmtc1hmzqi5j5kr4e">
         <w:r>
           <w:rPr>
             <w:sz w:val="18"/>
@@ -19538,7 +19538,7 @@
         </w:numPr>
         <w:spacing w:after="60"/>
       </w:pPr>
-      <w:hyperlink w:history="1" r:id="rIdiczlgwfjwpazn8cgnyayt">
+      <w:hyperlink w:history="1" r:id="rIdhczoyq-ew_0dizdmzq1kg">
         <w:r>
           <w:rPr>
             <w:sz w:val="18"/>
@@ -19566,7 +19566,7 @@
         </w:numPr>
         <w:spacing w:after="60"/>
       </w:pPr>
-      <w:hyperlink w:history="1" r:id="rIdnycbmgi2xrglmgwtmsslv">
+      <w:hyperlink w:history="1" r:id="rId35d4p9ux90d30cdmrkxf-">
         <w:r>
           <w:rPr>
             <w:sz w:val="18"/>
@@ -19594,7 +19594,7 @@
         </w:numPr>
         <w:spacing w:after="60"/>
       </w:pPr>
-      <w:hyperlink w:history="1" r:id="rId20ioi9vginbdezsub4xho">
+      <w:hyperlink w:history="1" r:id="rIdb122ic-np1v3-z-pdvhbl">
         <w:r>
           <w:rPr>
             <w:sz w:val="18"/>
@@ -19622,7 +19622,7 @@
         </w:numPr>
         <w:spacing w:after="60"/>
       </w:pPr>
-      <w:hyperlink w:history="1" r:id="rIdegn3hfmraeutlf_98wpbg">
+      <w:hyperlink w:history="1" r:id="rIdyzygn4a4gjhaaavrnusan">
         <w:r>
           <w:rPr>
             <w:sz w:val="18"/>
@@ -19650,7 +19650,7 @@
         </w:numPr>
         <w:spacing w:after="60"/>
       </w:pPr>
-      <w:hyperlink w:history="1" r:id="rIds_fa38rrememoqenm_ljk">
+      <w:hyperlink w:history="1" r:id="rIdkqsnudxc_pbihscthuw-9">
         <w:r>
           <w:rPr>
             <w:sz w:val="18"/>
@@ -19678,7 +19678,7 @@
         </w:numPr>
         <w:spacing w:after="60"/>
       </w:pPr>
-      <w:hyperlink w:history="1" r:id="rIdvukjnsgqihsmm2nrwtxvs">
+      <w:hyperlink w:history="1" r:id="rIdgeyc5hwqhvvdrj5ioxksw">
         <w:r>
           <w:rPr>
             <w:sz w:val="18"/>
@@ -19706,7 +19706,7 @@
         </w:numPr>
         <w:spacing w:after="60"/>
       </w:pPr>
-      <w:hyperlink w:history="1" r:id="rIdu4fdfohqxwupu4f6wa84d">
+      <w:hyperlink w:history="1" r:id="rIdejkkn52wsj6rzx4ekeiae">
         <w:r>
           <w:rPr>
             <w:sz w:val="18"/>
@@ -19734,7 +19734,7 @@
         </w:numPr>
         <w:spacing w:after="60"/>
       </w:pPr>
-      <w:hyperlink w:history="1" r:id="rIduamohwwrlcstadvthpufr">
+      <w:hyperlink w:history="1" r:id="rId7fjn3o7wjvuvmk2-8qsyh">
         <w:r>
           <w:rPr>
             <w:sz w:val="18"/>
@@ -19762,7 +19762,7 @@
         </w:numPr>
         <w:spacing w:after="60"/>
       </w:pPr>
-      <w:hyperlink w:history="1" r:id="rIdwcmwae9xptqcoawqpeeha">
+      <w:hyperlink w:history="1" r:id="rIdxhuhftv6entbiddcuktgx">
         <w:r>
           <w:rPr>
             <w:sz w:val="18"/>
@@ -19790,7 +19790,7 @@
         </w:numPr>
         <w:spacing w:after="60"/>
       </w:pPr>
-      <w:hyperlink w:history="1" r:id="rIdmxtmaqbehmmelh7zz0cwl">
+      <w:hyperlink w:history="1" r:id="rIdqbgcc6kswrbzvxu-qokw-">
         <w:r>
           <w:rPr>
             <w:sz w:val="18"/>
@@ -19818,7 +19818,7 @@
         </w:numPr>
         <w:spacing w:after="60"/>
       </w:pPr>
-      <w:hyperlink w:history="1" r:id="rId_nbqjnavr8ybihnxjj4mj">
+      <w:hyperlink w:history="1" r:id="rIdcqew0ambzilxzcudkdott">
         <w:r>
           <w:rPr>
             <w:sz w:val="18"/>
@@ -19846,7 +19846,7 @@
         </w:numPr>
         <w:spacing w:after="60"/>
       </w:pPr>
-      <w:hyperlink w:history="1" r:id="rIdu_kdndepyffaqgpyacmxl">
+      <w:hyperlink w:history="1" r:id="rId4izehdbn1isprfrl3ggvb">
         <w:r>
           <w:rPr>
             <w:sz w:val="18"/>
@@ -19874,7 +19874,7 @@
         </w:numPr>
         <w:spacing w:after="60"/>
       </w:pPr>
-      <w:hyperlink w:history="1" r:id="rIdzcaakqnj71riosorkhzcs">
+      <w:hyperlink w:history="1" r:id="rIde7kuau68p6ygxnycxmmzf">
         <w:r>
           <w:rPr>
             <w:sz w:val="18"/>
@@ -19902,7 +19902,7 @@
         </w:numPr>
         <w:spacing w:after="60"/>
       </w:pPr>
-      <w:hyperlink w:history="1" r:id="rIds02y38kykinxclvm1ybd4">
+      <w:hyperlink w:history="1" r:id="rIdfn2blexvmdvgtrfm6owg9">
         <w:r>
           <w:rPr>
             <w:sz w:val="18"/>
@@ -19930,7 +19930,7 @@
         </w:numPr>
         <w:spacing w:after="60"/>
       </w:pPr>
-      <w:hyperlink w:history="1" r:id="rIdjn83kqpycecdaldgbtmu-">
+      <w:hyperlink w:history="1" r:id="rIddwkcclsx9mwxkb_oa0r0a">
         <w:r>
           <w:rPr>
             <w:sz w:val="18"/>
@@ -19958,7 +19958,7 @@
         </w:numPr>
         <w:spacing w:after="60"/>
       </w:pPr>
-      <w:hyperlink w:history="1" r:id="rIdzvjegem9vvsgsrg98k3nt">
+      <w:hyperlink w:history="1" r:id="rIdtuum6cwnmwdaot_2c18uh">
         <w:r>
           <w:rPr>
             <w:sz w:val="18"/>

</xml_diff>